<commit_message>
Amend README and fix export package spec for stats_export
</commit_message>
<xml_diff>
--- a/documentation/Read Me.docx
+++ b/documentation/Read Me.docx
@@ -259,7 +259,7 @@
                     <w:docPart w:val="1044D2AAB96043E0A1F96645405FAD85"/>
                   </w:placeholder>
                   <w:dataBinding w:prefixMappings="xmlns:ns0='http://schemas.microsoft.com/office/2006/coverPageProps'" w:xpath="/ns0:CoverPageProperties[1]/ns0:PublishDate[1]" w:storeItemID="{55AF091B-3C7A-41E3-B477-F2FDAA23CFDA}"/>
-                  <w:date w:fullDate="2026-04-12T00:00:00Z">
+                  <w:date w:fullDate="2026-05-15T00:00:00Z">
                     <w:dateFormat w:val="M-d-yyyy"/>
                     <w:lid w:val="en-US"/>
                     <w:storeMappedDataAs w:val="dateTime"/>
@@ -282,7 +282,7 @@
                         <w:sz w:val="28"/>
                         <w:szCs w:val="28"/>
                       </w:rPr>
-                      <w:t>4-12-2026</w:t>
+                      <w:t>5-15-2026</w:t>
                     </w:r>
                   </w:p>
                 </w:sdtContent>
@@ -369,7 +369,7 @@
           <w:r>
             <w:fldChar w:fldCharType="separate"/>
           </w:r>
-          <w:hyperlink w:anchor="_Toc227613184" w:history="1">
+          <w:hyperlink w:anchor="_Toc229765993" w:history="1">
             <w:r>
               <w:rPr>
                 <w:rStyle w:val="Hyperlink"/>
@@ -396,7 +396,7 @@
                 <w:noProof/>
                 <w:webHidden/>
               </w:rPr>
-              <w:instrText xml:space="preserve"> PAGEREF _Toc227613184 \h </w:instrText>
+              <w:instrText xml:space="preserve"> PAGEREF _Toc229765993 \h </w:instrText>
             </w:r>
             <w:r>
               <w:rPr>
@@ -443,7 +443,7 @@
               <w14:ligatures w14:val="standardContextual"/>
             </w:rPr>
           </w:pPr>
-          <w:hyperlink w:anchor="_Toc227613185" w:history="1">
+          <w:hyperlink w:anchor="_Toc229765994" w:history="1">
             <w:r>
               <w:rPr>
                 <w:rStyle w:val="Hyperlink"/>
@@ -470,7 +470,7 @@
                 <w:noProof/>
                 <w:webHidden/>
               </w:rPr>
-              <w:instrText xml:space="preserve"> PAGEREF _Toc227613185 \h </w:instrText>
+              <w:instrText xml:space="preserve"> PAGEREF _Toc229765994 \h </w:instrText>
             </w:r>
             <w:r>
               <w:rPr>
@@ -517,7 +517,7 @@
               <w14:ligatures w14:val="standardContextual"/>
             </w:rPr>
           </w:pPr>
-          <w:hyperlink w:anchor="_Toc227613186" w:history="1">
+          <w:hyperlink w:anchor="_Toc229765995" w:history="1">
             <w:r>
               <w:rPr>
                 <w:rStyle w:val="Hyperlink"/>
@@ -544,7 +544,7 @@
                 <w:noProof/>
                 <w:webHidden/>
               </w:rPr>
-              <w:instrText xml:space="preserve"> PAGEREF _Toc227613186 \h </w:instrText>
+              <w:instrText xml:space="preserve"> PAGEREF _Toc229765995 \h </w:instrText>
             </w:r>
             <w:r>
               <w:rPr>
@@ -591,7 +591,7 @@
               <w14:ligatures w14:val="standardContextual"/>
             </w:rPr>
           </w:pPr>
-          <w:hyperlink w:anchor="_Toc227613187" w:history="1">
+          <w:hyperlink w:anchor="_Toc229765996" w:history="1">
             <w:r>
               <w:rPr>
                 <w:rStyle w:val="Hyperlink"/>
@@ -618,7 +618,7 @@
                 <w:noProof/>
                 <w:webHidden/>
               </w:rPr>
-              <w:instrText xml:space="preserve"> PAGEREF _Toc227613187 \h </w:instrText>
+              <w:instrText xml:space="preserve"> PAGEREF _Toc229765996 \h </w:instrText>
             </w:r>
             <w:r>
               <w:rPr>
@@ -665,7 +665,7 @@
               <w14:ligatures w14:val="standardContextual"/>
             </w:rPr>
           </w:pPr>
-          <w:hyperlink w:anchor="_Toc227613188" w:history="1">
+          <w:hyperlink w:anchor="_Toc229765997" w:history="1">
             <w:r>
               <w:rPr>
                 <w:rStyle w:val="Hyperlink"/>
@@ -692,7 +692,7 @@
                 <w:noProof/>
                 <w:webHidden/>
               </w:rPr>
-              <w:instrText xml:space="preserve"> PAGEREF _Toc227613188 \h </w:instrText>
+              <w:instrText xml:space="preserve"> PAGEREF _Toc229765997 \h </w:instrText>
             </w:r>
             <w:r>
               <w:rPr>
@@ -739,7 +739,7 @@
               <w14:ligatures w14:val="standardContextual"/>
             </w:rPr>
           </w:pPr>
-          <w:hyperlink w:anchor="_Toc227613189" w:history="1">
+          <w:hyperlink w:anchor="_Toc229765998" w:history="1">
             <w:r>
               <w:rPr>
                 <w:rStyle w:val="Hyperlink"/>
@@ -766,7 +766,7 @@
                 <w:noProof/>
                 <w:webHidden/>
               </w:rPr>
-              <w:instrText xml:space="preserve"> PAGEREF _Toc227613189 \h </w:instrText>
+              <w:instrText xml:space="preserve"> PAGEREF _Toc229765998 \h </w:instrText>
             </w:r>
             <w:r>
               <w:rPr>
@@ -813,7 +813,7 @@
               <w14:ligatures w14:val="standardContextual"/>
             </w:rPr>
           </w:pPr>
-          <w:hyperlink w:anchor="_Toc227613190" w:history="1">
+          <w:hyperlink w:anchor="_Toc229765999" w:history="1">
             <w:r>
               <w:rPr>
                 <w:rStyle w:val="Hyperlink"/>
@@ -840,7 +840,7 @@
                 <w:noProof/>
                 <w:webHidden/>
               </w:rPr>
-              <w:instrText xml:space="preserve"> PAGEREF _Toc227613190 \h </w:instrText>
+              <w:instrText xml:space="preserve"> PAGEREF _Toc229765999 \h </w:instrText>
             </w:r>
             <w:r>
               <w:rPr>
@@ -887,7 +887,7 @@
               <w14:ligatures w14:val="standardContextual"/>
             </w:rPr>
           </w:pPr>
-          <w:hyperlink w:anchor="_Toc227613191" w:history="1">
+          <w:hyperlink w:anchor="_Toc229766000" w:history="1">
             <w:r>
               <w:rPr>
                 <w:rStyle w:val="Hyperlink"/>
@@ -914,7 +914,7 @@
                 <w:noProof/>
                 <w:webHidden/>
               </w:rPr>
-              <w:instrText xml:space="preserve"> PAGEREF _Toc227613191 \h </w:instrText>
+              <w:instrText xml:space="preserve"> PAGEREF _Toc229766000 \h </w:instrText>
             </w:r>
             <w:r>
               <w:rPr>
@@ -961,7 +961,7 @@
               <w14:ligatures w14:val="standardContextual"/>
             </w:rPr>
           </w:pPr>
-          <w:hyperlink w:anchor="_Toc227613192" w:history="1">
+          <w:hyperlink w:anchor="_Toc229766001" w:history="1">
             <w:r>
               <w:rPr>
                 <w:rStyle w:val="Hyperlink"/>
@@ -988,7 +988,7 @@
                 <w:noProof/>
                 <w:webHidden/>
               </w:rPr>
-              <w:instrText xml:space="preserve"> PAGEREF _Toc227613192 \h </w:instrText>
+              <w:instrText xml:space="preserve"> PAGEREF _Toc229766001 \h </w:instrText>
             </w:r>
             <w:r>
               <w:rPr>
@@ -1035,7 +1035,7 @@
               <w14:ligatures w14:val="standardContextual"/>
             </w:rPr>
           </w:pPr>
-          <w:hyperlink w:anchor="_Toc227613193" w:history="1">
+          <w:hyperlink w:anchor="_Toc229766002" w:history="1">
             <w:r>
               <w:rPr>
                 <w:rStyle w:val="Hyperlink"/>
@@ -1062,7 +1062,7 @@
                 <w:noProof/>
                 <w:webHidden/>
               </w:rPr>
-              <w:instrText xml:space="preserve"> PAGEREF _Toc227613193 \h </w:instrText>
+              <w:instrText xml:space="preserve"> PAGEREF _Toc229766002 \h </w:instrText>
             </w:r>
             <w:r>
               <w:rPr>
@@ -1109,7 +1109,7 @@
               <w14:ligatures w14:val="standardContextual"/>
             </w:rPr>
           </w:pPr>
-          <w:hyperlink w:anchor="_Toc227613194" w:history="1">
+          <w:hyperlink w:anchor="_Toc229766003" w:history="1">
             <w:r>
               <w:rPr>
                 <w:rStyle w:val="Hyperlink"/>
@@ -1136,7 +1136,7 @@
                 <w:noProof/>
                 <w:webHidden/>
               </w:rPr>
-              <w:instrText xml:space="preserve"> PAGEREF _Toc227613194 \h </w:instrText>
+              <w:instrText xml:space="preserve"> PAGEREF _Toc229766003 \h </w:instrText>
             </w:r>
             <w:r>
               <w:rPr>
@@ -1183,7 +1183,7 @@
               <w14:ligatures w14:val="standardContextual"/>
             </w:rPr>
           </w:pPr>
-          <w:hyperlink w:anchor="_Toc227613195" w:history="1">
+          <w:hyperlink w:anchor="_Toc229766004" w:history="1">
             <w:r>
               <w:rPr>
                 <w:rStyle w:val="Hyperlink"/>
@@ -1210,7 +1210,7 @@
                 <w:noProof/>
                 <w:webHidden/>
               </w:rPr>
-              <w:instrText xml:space="preserve"> PAGEREF _Toc227613195 \h </w:instrText>
+              <w:instrText xml:space="preserve"> PAGEREF _Toc229766004 \h </w:instrText>
             </w:r>
             <w:r>
               <w:rPr>
@@ -1257,7 +1257,7 @@
               <w14:ligatures w14:val="standardContextual"/>
             </w:rPr>
           </w:pPr>
-          <w:hyperlink w:anchor="_Toc227613196" w:history="1">
+          <w:hyperlink w:anchor="_Toc229766005" w:history="1">
             <w:r>
               <w:rPr>
                 <w:rStyle w:val="Hyperlink"/>
@@ -1284,7 +1284,7 @@
                 <w:noProof/>
                 <w:webHidden/>
               </w:rPr>
-              <w:instrText xml:space="preserve"> PAGEREF _Toc227613196 \h </w:instrText>
+              <w:instrText xml:space="preserve"> PAGEREF _Toc229766005 \h </w:instrText>
             </w:r>
             <w:r>
               <w:rPr>
@@ -1331,7 +1331,7 @@
               <w14:ligatures w14:val="standardContextual"/>
             </w:rPr>
           </w:pPr>
-          <w:hyperlink w:anchor="_Toc227613197" w:history="1">
+          <w:hyperlink w:anchor="_Toc229766006" w:history="1">
             <w:r>
               <w:rPr>
                 <w:rStyle w:val="Hyperlink"/>
@@ -1358,7 +1358,7 @@
                 <w:noProof/>
                 <w:webHidden/>
               </w:rPr>
-              <w:instrText xml:space="preserve"> PAGEREF _Toc227613197 \h </w:instrText>
+              <w:instrText xml:space="preserve"> PAGEREF _Toc229766006 \h </w:instrText>
             </w:r>
             <w:r>
               <w:rPr>
@@ -1405,7 +1405,7 @@
               <w14:ligatures w14:val="standardContextual"/>
             </w:rPr>
           </w:pPr>
-          <w:hyperlink w:anchor="_Toc227613198" w:history="1">
+          <w:hyperlink w:anchor="_Toc229766007" w:history="1">
             <w:r>
               <w:rPr>
                 <w:rStyle w:val="Hyperlink"/>
@@ -1432,7 +1432,7 @@
                 <w:noProof/>
                 <w:webHidden/>
               </w:rPr>
-              <w:instrText xml:space="preserve"> PAGEREF _Toc227613198 \h </w:instrText>
+              <w:instrText xml:space="preserve"> PAGEREF _Toc229766007 \h </w:instrText>
             </w:r>
             <w:r>
               <w:rPr>
@@ -1479,7 +1479,7 @@
               <w14:ligatures w14:val="standardContextual"/>
             </w:rPr>
           </w:pPr>
-          <w:hyperlink w:anchor="_Toc227613199" w:history="1">
+          <w:hyperlink w:anchor="_Toc229766008" w:history="1">
             <w:r>
               <w:rPr>
                 <w:rStyle w:val="Hyperlink"/>
@@ -1506,7 +1506,7 @@
                 <w:noProof/>
                 <w:webHidden/>
               </w:rPr>
-              <w:instrText xml:space="preserve"> PAGEREF _Toc227613199 \h </w:instrText>
+              <w:instrText xml:space="preserve"> PAGEREF _Toc229766008 \h </w:instrText>
             </w:r>
             <w:r>
               <w:rPr>
@@ -1553,7 +1553,7 @@
               <w14:ligatures w14:val="standardContextual"/>
             </w:rPr>
           </w:pPr>
-          <w:hyperlink w:anchor="_Toc227613200" w:history="1">
+          <w:hyperlink w:anchor="_Toc229766009" w:history="1">
             <w:r>
               <w:rPr>
                 <w:rStyle w:val="Hyperlink"/>
@@ -1580,7 +1580,7 @@
                 <w:noProof/>
                 <w:webHidden/>
               </w:rPr>
-              <w:instrText xml:space="preserve"> PAGEREF _Toc227613200 \h </w:instrText>
+              <w:instrText xml:space="preserve"> PAGEREF _Toc229766009 \h </w:instrText>
             </w:r>
             <w:r>
               <w:rPr>
@@ -1627,7 +1627,7 @@
               <w14:ligatures w14:val="standardContextual"/>
             </w:rPr>
           </w:pPr>
-          <w:hyperlink w:anchor="_Toc227613201" w:history="1">
+          <w:hyperlink w:anchor="_Toc229766010" w:history="1">
             <w:r>
               <w:rPr>
                 <w:rStyle w:val="Hyperlink"/>
@@ -1654,7 +1654,7 @@
                 <w:noProof/>
                 <w:webHidden/>
               </w:rPr>
-              <w:instrText xml:space="preserve"> PAGEREF _Toc227613201 \h </w:instrText>
+              <w:instrText xml:space="preserve"> PAGEREF _Toc229766010 \h </w:instrText>
             </w:r>
             <w:r>
               <w:rPr>
@@ -1701,7 +1701,7 @@
               <w14:ligatures w14:val="standardContextual"/>
             </w:rPr>
           </w:pPr>
-          <w:hyperlink w:anchor="_Toc227613202" w:history="1">
+          <w:hyperlink w:anchor="_Toc229766011" w:history="1">
             <w:r>
               <w:rPr>
                 <w:rStyle w:val="Hyperlink"/>
@@ -1728,7 +1728,7 @@
                 <w:noProof/>
                 <w:webHidden/>
               </w:rPr>
-              <w:instrText xml:space="preserve"> PAGEREF _Toc227613202 \h </w:instrText>
+              <w:instrText xml:space="preserve"> PAGEREF _Toc229766011 \h </w:instrText>
             </w:r>
             <w:r>
               <w:rPr>
@@ -1775,7 +1775,7 @@
               <w14:ligatures w14:val="standardContextual"/>
             </w:rPr>
           </w:pPr>
-          <w:hyperlink w:anchor="_Toc227613203" w:history="1">
+          <w:hyperlink w:anchor="_Toc229766012" w:history="1">
             <w:r>
               <w:rPr>
                 <w:rStyle w:val="Hyperlink"/>
@@ -1802,7 +1802,7 @@
                 <w:noProof/>
                 <w:webHidden/>
               </w:rPr>
-              <w:instrText xml:space="preserve"> PAGEREF _Toc227613203 \h </w:instrText>
+              <w:instrText xml:space="preserve"> PAGEREF _Toc229766012 \h </w:instrText>
             </w:r>
             <w:r>
               <w:rPr>
@@ -1849,7 +1849,7 @@
               <w14:ligatures w14:val="standardContextual"/>
             </w:rPr>
           </w:pPr>
-          <w:hyperlink w:anchor="_Toc227613204" w:history="1">
+          <w:hyperlink w:anchor="_Toc229766013" w:history="1">
             <w:r>
               <w:rPr>
                 <w:rStyle w:val="Hyperlink"/>
@@ -1876,7 +1876,7 @@
                 <w:noProof/>
                 <w:webHidden/>
               </w:rPr>
-              <w:instrText xml:space="preserve"> PAGEREF _Toc227613204 \h </w:instrText>
+              <w:instrText xml:space="preserve"> PAGEREF _Toc229766013 \h </w:instrText>
             </w:r>
             <w:r>
               <w:rPr>
@@ -1923,7 +1923,7 @@
               <w14:ligatures w14:val="standardContextual"/>
             </w:rPr>
           </w:pPr>
-          <w:hyperlink w:anchor="_Toc227613205" w:history="1">
+          <w:hyperlink w:anchor="_Toc229766014" w:history="1">
             <w:r>
               <w:rPr>
                 <w:rStyle w:val="Hyperlink"/>
@@ -1950,7 +1950,7 @@
                 <w:noProof/>
                 <w:webHidden/>
               </w:rPr>
-              <w:instrText xml:space="preserve"> PAGEREF _Toc227613205 \h </w:instrText>
+              <w:instrText xml:space="preserve"> PAGEREF _Toc229766014 \h </w:instrText>
             </w:r>
             <w:r>
               <w:rPr>
@@ -1997,7 +1997,7 @@
               <w14:ligatures w14:val="standardContextual"/>
             </w:rPr>
           </w:pPr>
-          <w:hyperlink w:anchor="_Toc227613206" w:history="1">
+          <w:hyperlink w:anchor="_Toc229766015" w:history="1">
             <w:r>
               <w:rPr>
                 <w:rStyle w:val="Hyperlink"/>
@@ -2024,7 +2024,7 @@
                 <w:noProof/>
                 <w:webHidden/>
               </w:rPr>
-              <w:instrText xml:space="preserve"> PAGEREF _Toc227613206 \h </w:instrText>
+              <w:instrText xml:space="preserve"> PAGEREF _Toc229766015 \h </w:instrText>
             </w:r>
             <w:r>
               <w:rPr>
@@ -2071,7 +2071,7 @@
               <w14:ligatures w14:val="standardContextual"/>
             </w:rPr>
           </w:pPr>
-          <w:hyperlink w:anchor="_Toc227613207" w:history="1">
+          <w:hyperlink w:anchor="_Toc229766016" w:history="1">
             <w:r>
               <w:rPr>
                 <w:rStyle w:val="Hyperlink"/>
@@ -2098,7 +2098,7 @@
                 <w:noProof/>
                 <w:webHidden/>
               </w:rPr>
-              <w:instrText xml:space="preserve"> PAGEREF _Toc227613207 \h </w:instrText>
+              <w:instrText xml:space="preserve"> PAGEREF _Toc229766016 \h </w:instrText>
             </w:r>
             <w:r>
               <w:rPr>
@@ -2145,7 +2145,7 @@
               <w14:ligatures w14:val="standardContextual"/>
             </w:rPr>
           </w:pPr>
-          <w:hyperlink w:anchor="_Toc227613208" w:history="1">
+          <w:hyperlink w:anchor="_Toc229766017" w:history="1">
             <w:r>
               <w:rPr>
                 <w:rStyle w:val="Hyperlink"/>
@@ -2172,7 +2172,7 @@
                 <w:noProof/>
                 <w:webHidden/>
               </w:rPr>
-              <w:instrText xml:space="preserve"> PAGEREF _Toc227613208 \h </w:instrText>
+              <w:instrText xml:space="preserve"> PAGEREF _Toc229766017 \h </w:instrText>
             </w:r>
             <w:r>
               <w:rPr>
@@ -2219,7 +2219,7 @@
               <w14:ligatures w14:val="standardContextual"/>
             </w:rPr>
           </w:pPr>
-          <w:hyperlink w:anchor="_Toc227613209" w:history="1">
+          <w:hyperlink w:anchor="_Toc229766018" w:history="1">
             <w:r>
               <w:rPr>
                 <w:rStyle w:val="Hyperlink"/>
@@ -2246,7 +2246,7 @@
                 <w:noProof/>
                 <w:webHidden/>
               </w:rPr>
-              <w:instrText xml:space="preserve"> PAGEREF _Toc227613209 \h </w:instrText>
+              <w:instrText xml:space="preserve"> PAGEREF _Toc229766018 \h </w:instrText>
             </w:r>
             <w:r>
               <w:rPr>
@@ -2293,7 +2293,7 @@
               <w14:ligatures w14:val="standardContextual"/>
             </w:rPr>
           </w:pPr>
-          <w:hyperlink w:anchor="_Toc227613210" w:history="1">
+          <w:hyperlink w:anchor="_Toc229766019" w:history="1">
             <w:r>
               <w:rPr>
                 <w:rStyle w:val="Hyperlink"/>
@@ -2320,7 +2320,7 @@
                 <w:noProof/>
                 <w:webHidden/>
               </w:rPr>
-              <w:instrText xml:space="preserve"> PAGEREF _Toc227613210 \h </w:instrText>
+              <w:instrText xml:space="preserve"> PAGEREF _Toc229766019 \h </w:instrText>
             </w:r>
             <w:r>
               <w:rPr>
@@ -2367,7 +2367,7 @@
               <w14:ligatures w14:val="standardContextual"/>
             </w:rPr>
           </w:pPr>
-          <w:hyperlink w:anchor="_Toc227613211" w:history="1">
+          <w:hyperlink w:anchor="_Toc229766020" w:history="1">
             <w:r>
               <w:rPr>
                 <w:rStyle w:val="Hyperlink"/>
@@ -2394,7 +2394,7 @@
                 <w:noProof/>
                 <w:webHidden/>
               </w:rPr>
-              <w:instrText xml:space="preserve"> PAGEREF _Toc227613211 \h </w:instrText>
+              <w:instrText xml:space="preserve"> PAGEREF _Toc229766020 \h </w:instrText>
             </w:r>
             <w:r>
               <w:rPr>
@@ -2441,7 +2441,7 @@
               <w14:ligatures w14:val="standardContextual"/>
             </w:rPr>
           </w:pPr>
-          <w:hyperlink w:anchor="_Toc227613212" w:history="1">
+          <w:hyperlink w:anchor="_Toc229766021" w:history="1">
             <w:r>
               <w:rPr>
                 <w:rStyle w:val="Hyperlink"/>
@@ -2468,7 +2468,7 @@
                 <w:noProof/>
                 <w:webHidden/>
               </w:rPr>
-              <w:instrText xml:space="preserve"> PAGEREF _Toc227613212 \h </w:instrText>
+              <w:instrText xml:space="preserve"> PAGEREF _Toc229766021 \h </w:instrText>
             </w:r>
             <w:r>
               <w:rPr>
@@ -2515,7 +2515,7 @@
               <w14:ligatures w14:val="standardContextual"/>
             </w:rPr>
           </w:pPr>
-          <w:hyperlink w:anchor="_Toc227613213" w:history="1">
+          <w:hyperlink w:anchor="_Toc229766022" w:history="1">
             <w:r>
               <w:rPr>
                 <w:rStyle w:val="Hyperlink"/>
@@ -2542,7 +2542,7 @@
                 <w:noProof/>
                 <w:webHidden/>
               </w:rPr>
-              <w:instrText xml:space="preserve"> PAGEREF _Toc227613213 \h </w:instrText>
+              <w:instrText xml:space="preserve"> PAGEREF _Toc229766022 \h </w:instrText>
             </w:r>
             <w:r>
               <w:rPr>
@@ -2589,7 +2589,7 @@
               <w14:ligatures w14:val="standardContextual"/>
             </w:rPr>
           </w:pPr>
-          <w:hyperlink w:anchor="_Toc227613214" w:history="1">
+          <w:hyperlink w:anchor="_Toc229766023" w:history="1">
             <w:r>
               <w:rPr>
                 <w:rStyle w:val="Hyperlink"/>
@@ -2616,7 +2616,7 @@
                 <w:noProof/>
                 <w:webHidden/>
               </w:rPr>
-              <w:instrText xml:space="preserve"> PAGEREF _Toc227613214 \h </w:instrText>
+              <w:instrText xml:space="preserve"> PAGEREF _Toc229766023 \h </w:instrText>
             </w:r>
             <w:r>
               <w:rPr>
@@ -2663,7 +2663,7 @@
               <w14:ligatures w14:val="standardContextual"/>
             </w:rPr>
           </w:pPr>
-          <w:hyperlink w:anchor="_Toc227613215" w:history="1">
+          <w:hyperlink w:anchor="_Toc229766024" w:history="1">
             <w:r>
               <w:rPr>
                 <w:rStyle w:val="Hyperlink"/>
@@ -2690,7 +2690,7 @@
                 <w:noProof/>
                 <w:webHidden/>
               </w:rPr>
-              <w:instrText xml:space="preserve"> PAGEREF _Toc227613215 \h </w:instrText>
+              <w:instrText xml:space="preserve"> PAGEREF _Toc229766024 \h </w:instrText>
             </w:r>
             <w:r>
               <w:rPr>
@@ -2737,7 +2737,7 @@
               <w14:ligatures w14:val="standardContextual"/>
             </w:rPr>
           </w:pPr>
-          <w:hyperlink w:anchor="_Toc227613216" w:history="1">
+          <w:hyperlink w:anchor="_Toc229766025" w:history="1">
             <w:r>
               <w:rPr>
                 <w:rStyle w:val="Hyperlink"/>
@@ -2764,7 +2764,7 @@
                 <w:noProof/>
                 <w:webHidden/>
               </w:rPr>
-              <w:instrText xml:space="preserve"> PAGEREF _Toc227613216 \h </w:instrText>
+              <w:instrText xml:space="preserve"> PAGEREF _Toc229766025 \h </w:instrText>
             </w:r>
             <w:r>
               <w:rPr>
@@ -2811,7 +2811,7 @@
               <w14:ligatures w14:val="standardContextual"/>
             </w:rPr>
           </w:pPr>
-          <w:hyperlink w:anchor="_Toc227613217" w:history="1">
+          <w:hyperlink w:anchor="_Toc229766026" w:history="1">
             <w:r>
               <w:rPr>
                 <w:rStyle w:val="Hyperlink"/>
@@ -2838,7 +2838,7 @@
                 <w:noProof/>
                 <w:webHidden/>
               </w:rPr>
-              <w:instrText xml:space="preserve"> PAGEREF _Toc227613217 \h </w:instrText>
+              <w:instrText xml:space="preserve"> PAGEREF _Toc229766026 \h </w:instrText>
             </w:r>
             <w:r>
               <w:rPr>
@@ -2885,7 +2885,7 @@
               <w14:ligatures w14:val="standardContextual"/>
             </w:rPr>
           </w:pPr>
-          <w:hyperlink w:anchor="_Toc227613218" w:history="1">
+          <w:hyperlink w:anchor="_Toc229766027" w:history="1">
             <w:r>
               <w:rPr>
                 <w:rStyle w:val="Hyperlink"/>
@@ -2912,7 +2912,7 @@
                 <w:noProof/>
                 <w:webHidden/>
               </w:rPr>
-              <w:instrText xml:space="preserve"> PAGEREF _Toc227613218 \h </w:instrText>
+              <w:instrText xml:space="preserve"> PAGEREF _Toc229766027 \h </w:instrText>
             </w:r>
             <w:r>
               <w:rPr>
@@ -2959,7 +2959,7 @@
               <w14:ligatures w14:val="standardContextual"/>
             </w:rPr>
           </w:pPr>
-          <w:hyperlink w:anchor="_Toc227613219" w:history="1">
+          <w:hyperlink w:anchor="_Toc229766028" w:history="1">
             <w:r>
               <w:rPr>
                 <w:rStyle w:val="Hyperlink"/>
@@ -2986,7 +2986,7 @@
                 <w:noProof/>
                 <w:webHidden/>
               </w:rPr>
-              <w:instrText xml:space="preserve"> PAGEREF _Toc227613219 \h </w:instrText>
+              <w:instrText xml:space="preserve"> PAGEREF _Toc229766028 \h </w:instrText>
             </w:r>
             <w:r>
               <w:rPr>
@@ -3033,7 +3033,7 @@
               <w14:ligatures w14:val="standardContextual"/>
             </w:rPr>
           </w:pPr>
-          <w:hyperlink w:anchor="_Toc227613220" w:history="1">
+          <w:hyperlink w:anchor="_Toc229766029" w:history="1">
             <w:r>
               <w:rPr>
                 <w:rStyle w:val="Hyperlink"/>
@@ -3060,7 +3060,7 @@
                 <w:noProof/>
                 <w:webHidden/>
               </w:rPr>
-              <w:instrText xml:space="preserve"> PAGEREF _Toc227613220 \h </w:instrText>
+              <w:instrText xml:space="preserve"> PAGEREF _Toc229766029 \h </w:instrText>
             </w:r>
             <w:r>
               <w:rPr>
@@ -3107,7 +3107,7 @@
               <w14:ligatures w14:val="standardContextual"/>
             </w:rPr>
           </w:pPr>
-          <w:hyperlink w:anchor="_Toc227613221" w:history="1">
+          <w:hyperlink w:anchor="_Toc229766030" w:history="1">
             <w:r>
               <w:rPr>
                 <w:rStyle w:val="Hyperlink"/>
@@ -3134,7 +3134,7 @@
                 <w:noProof/>
                 <w:webHidden/>
               </w:rPr>
-              <w:instrText xml:space="preserve"> PAGEREF _Toc227613221 \h </w:instrText>
+              <w:instrText xml:space="preserve"> PAGEREF _Toc229766030 \h </w:instrText>
             </w:r>
             <w:r>
               <w:rPr>
@@ -3181,7 +3181,7 @@
               <w14:ligatures w14:val="standardContextual"/>
             </w:rPr>
           </w:pPr>
-          <w:hyperlink w:anchor="_Toc227613222" w:history="1">
+          <w:hyperlink w:anchor="_Toc229766031" w:history="1">
             <w:r>
               <w:rPr>
                 <w:rStyle w:val="Hyperlink"/>
@@ -3208,7 +3208,7 @@
                 <w:noProof/>
                 <w:webHidden/>
               </w:rPr>
-              <w:instrText xml:space="preserve"> PAGEREF _Toc227613222 \h </w:instrText>
+              <w:instrText xml:space="preserve"> PAGEREF _Toc229766031 \h </w:instrText>
             </w:r>
             <w:r>
               <w:rPr>
@@ -3255,7 +3255,7 @@
               <w14:ligatures w14:val="standardContextual"/>
             </w:rPr>
           </w:pPr>
-          <w:hyperlink w:anchor="_Toc227613223" w:history="1">
+          <w:hyperlink w:anchor="_Toc229766032" w:history="1">
             <w:r>
               <w:rPr>
                 <w:rStyle w:val="Hyperlink"/>
@@ -3282,7 +3282,7 @@
                 <w:noProof/>
                 <w:webHidden/>
               </w:rPr>
-              <w:instrText xml:space="preserve"> PAGEREF _Toc227613223 \h </w:instrText>
+              <w:instrText xml:space="preserve"> PAGEREF _Toc229766032 \h </w:instrText>
             </w:r>
             <w:r>
               <w:rPr>
@@ -3329,7 +3329,7 @@
               <w14:ligatures w14:val="standardContextual"/>
             </w:rPr>
           </w:pPr>
-          <w:hyperlink w:anchor="_Toc227613224" w:history="1">
+          <w:hyperlink w:anchor="_Toc229766033" w:history="1">
             <w:r>
               <w:rPr>
                 <w:rStyle w:val="Hyperlink"/>
@@ -3356,7 +3356,7 @@
                 <w:noProof/>
                 <w:webHidden/>
               </w:rPr>
-              <w:instrText xml:space="preserve"> PAGEREF _Toc227613224 \h </w:instrText>
+              <w:instrText xml:space="preserve"> PAGEREF _Toc229766033 \h </w:instrText>
             </w:r>
             <w:r>
               <w:rPr>
@@ -3403,7 +3403,7 @@
               <w14:ligatures w14:val="standardContextual"/>
             </w:rPr>
           </w:pPr>
-          <w:hyperlink w:anchor="_Toc227613225" w:history="1">
+          <w:hyperlink w:anchor="_Toc229766034" w:history="1">
             <w:r>
               <w:rPr>
                 <w:rStyle w:val="Hyperlink"/>
@@ -3430,7 +3430,7 @@
                 <w:noProof/>
                 <w:webHidden/>
               </w:rPr>
-              <w:instrText xml:space="preserve"> PAGEREF _Toc227613225 \h </w:instrText>
+              <w:instrText xml:space="preserve"> PAGEREF _Toc229766034 \h </w:instrText>
             </w:r>
             <w:r>
               <w:rPr>
@@ -3477,7 +3477,7 @@
               <w14:ligatures w14:val="standardContextual"/>
             </w:rPr>
           </w:pPr>
-          <w:hyperlink w:anchor="_Toc227613226" w:history="1">
+          <w:hyperlink w:anchor="_Toc229766035" w:history="1">
             <w:r>
               <w:rPr>
                 <w:rStyle w:val="Hyperlink"/>
@@ -3504,7 +3504,7 @@
                 <w:noProof/>
                 <w:webHidden/>
               </w:rPr>
-              <w:instrText xml:space="preserve"> PAGEREF _Toc227613226 \h </w:instrText>
+              <w:instrText xml:space="preserve"> PAGEREF _Toc229766035 \h </w:instrText>
             </w:r>
             <w:r>
               <w:rPr>
@@ -3551,7 +3551,7 @@
               <w14:ligatures w14:val="standardContextual"/>
             </w:rPr>
           </w:pPr>
-          <w:hyperlink w:anchor="_Toc227613227" w:history="1">
+          <w:hyperlink w:anchor="_Toc229766036" w:history="1">
             <w:r>
               <w:rPr>
                 <w:rStyle w:val="Hyperlink"/>
@@ -3578,7 +3578,7 @@
                 <w:noProof/>
                 <w:webHidden/>
               </w:rPr>
-              <w:instrText xml:space="preserve"> PAGEREF _Toc227613227 \h </w:instrText>
+              <w:instrText xml:space="preserve"> PAGEREF _Toc229766036 \h </w:instrText>
             </w:r>
             <w:r>
               <w:rPr>
@@ -3625,7 +3625,7 @@
               <w14:ligatures w14:val="standardContextual"/>
             </w:rPr>
           </w:pPr>
-          <w:hyperlink w:anchor="_Toc227613228" w:history="1">
+          <w:hyperlink w:anchor="_Toc229766037" w:history="1">
             <w:r>
               <w:rPr>
                 <w:rStyle w:val="Hyperlink"/>
@@ -3652,7 +3652,7 @@
                 <w:noProof/>
                 <w:webHidden/>
               </w:rPr>
-              <w:instrText xml:space="preserve"> PAGEREF _Toc227613228 \h </w:instrText>
+              <w:instrText xml:space="preserve"> PAGEREF _Toc229766037 \h </w:instrText>
             </w:r>
             <w:r>
               <w:rPr>
@@ -3699,7 +3699,7 @@
               <w14:ligatures w14:val="standardContextual"/>
             </w:rPr>
           </w:pPr>
-          <w:hyperlink w:anchor="_Toc227613229" w:history="1">
+          <w:hyperlink w:anchor="_Toc229766038" w:history="1">
             <w:r>
               <w:rPr>
                 <w:rStyle w:val="Hyperlink"/>
@@ -3726,7 +3726,7 @@
                 <w:noProof/>
                 <w:webHidden/>
               </w:rPr>
-              <w:instrText xml:space="preserve"> PAGEREF _Toc227613229 \h </w:instrText>
+              <w:instrText xml:space="preserve"> PAGEREF _Toc229766038 \h </w:instrText>
             </w:r>
             <w:r>
               <w:rPr>
@@ -3773,7 +3773,7 @@
               <w14:ligatures w14:val="standardContextual"/>
             </w:rPr>
           </w:pPr>
-          <w:hyperlink w:anchor="_Toc227613230" w:history="1">
+          <w:hyperlink w:anchor="_Toc229766039" w:history="1">
             <w:r>
               <w:rPr>
                 <w:rStyle w:val="Hyperlink"/>
@@ -3800,7 +3800,7 @@
                 <w:noProof/>
                 <w:webHidden/>
               </w:rPr>
-              <w:instrText xml:space="preserve"> PAGEREF _Toc227613230 \h </w:instrText>
+              <w:instrText xml:space="preserve"> PAGEREF _Toc229766039 \h </w:instrText>
             </w:r>
             <w:r>
               <w:rPr>
@@ -3847,7 +3847,7 @@
               <w14:ligatures w14:val="standardContextual"/>
             </w:rPr>
           </w:pPr>
-          <w:hyperlink w:anchor="_Toc227613231" w:history="1">
+          <w:hyperlink w:anchor="_Toc229766040" w:history="1">
             <w:r>
               <w:rPr>
                 <w:rStyle w:val="Hyperlink"/>
@@ -3874,7 +3874,7 @@
                 <w:noProof/>
                 <w:webHidden/>
               </w:rPr>
-              <w:instrText xml:space="preserve"> PAGEREF _Toc227613231 \h </w:instrText>
+              <w:instrText xml:space="preserve"> PAGEREF _Toc229766040 \h </w:instrText>
             </w:r>
             <w:r>
               <w:rPr>
@@ -3921,7 +3921,7 @@
               <w14:ligatures w14:val="standardContextual"/>
             </w:rPr>
           </w:pPr>
-          <w:hyperlink w:anchor="_Toc227613232" w:history="1">
+          <w:hyperlink w:anchor="_Toc229766041" w:history="1">
             <w:r>
               <w:rPr>
                 <w:rStyle w:val="Hyperlink"/>
@@ -3948,7 +3948,7 @@
                 <w:noProof/>
                 <w:webHidden/>
               </w:rPr>
-              <w:instrText xml:space="preserve"> PAGEREF _Toc227613232 \h </w:instrText>
+              <w:instrText xml:space="preserve"> PAGEREF _Toc229766041 \h </w:instrText>
             </w:r>
             <w:r>
               <w:rPr>
@@ -3995,7 +3995,7 @@
               <w14:ligatures w14:val="standardContextual"/>
             </w:rPr>
           </w:pPr>
-          <w:hyperlink w:anchor="_Toc227613233" w:history="1">
+          <w:hyperlink w:anchor="_Toc229766042" w:history="1">
             <w:r>
               <w:rPr>
                 <w:rStyle w:val="Hyperlink"/>
@@ -4022,7 +4022,7 @@
                 <w:noProof/>
                 <w:webHidden/>
               </w:rPr>
-              <w:instrText xml:space="preserve"> PAGEREF _Toc227613233 \h </w:instrText>
+              <w:instrText xml:space="preserve"> PAGEREF _Toc229766042 \h </w:instrText>
             </w:r>
             <w:r>
               <w:rPr>
@@ -4069,7 +4069,7 @@
               <w14:ligatures w14:val="standardContextual"/>
             </w:rPr>
           </w:pPr>
-          <w:hyperlink w:anchor="_Toc227613234" w:history="1">
+          <w:hyperlink w:anchor="_Toc229766043" w:history="1">
             <w:r>
               <w:rPr>
                 <w:rStyle w:val="Hyperlink"/>
@@ -4096,7 +4096,7 @@
                 <w:noProof/>
                 <w:webHidden/>
               </w:rPr>
-              <w:instrText xml:space="preserve"> PAGEREF _Toc227613234 \h </w:instrText>
+              <w:instrText xml:space="preserve"> PAGEREF _Toc229766043 \h </w:instrText>
             </w:r>
             <w:r>
               <w:rPr>
@@ -4143,7 +4143,7 @@
               <w14:ligatures w14:val="standardContextual"/>
             </w:rPr>
           </w:pPr>
-          <w:hyperlink w:anchor="_Toc227613235" w:history="1">
+          <w:hyperlink w:anchor="_Toc229766044" w:history="1">
             <w:r>
               <w:rPr>
                 <w:rStyle w:val="Hyperlink"/>
@@ -4170,7 +4170,7 @@
                 <w:noProof/>
                 <w:webHidden/>
               </w:rPr>
-              <w:instrText xml:space="preserve"> PAGEREF _Toc227613235 \h </w:instrText>
+              <w:instrText xml:space="preserve"> PAGEREF _Toc229766044 \h </w:instrText>
             </w:r>
             <w:r>
               <w:rPr>
@@ -4217,7 +4217,7 @@
               <w14:ligatures w14:val="standardContextual"/>
             </w:rPr>
           </w:pPr>
-          <w:hyperlink w:anchor="_Toc227613236" w:history="1">
+          <w:hyperlink w:anchor="_Toc229766045" w:history="1">
             <w:r>
               <w:rPr>
                 <w:rStyle w:val="Hyperlink"/>
@@ -4244,7 +4244,7 @@
                 <w:noProof/>
                 <w:webHidden/>
               </w:rPr>
-              <w:instrText xml:space="preserve"> PAGEREF _Toc227613236 \h </w:instrText>
+              <w:instrText xml:space="preserve"> PAGEREF _Toc229766045 \h </w:instrText>
             </w:r>
             <w:r>
               <w:rPr>
@@ -4291,7 +4291,7 @@
               <w14:ligatures w14:val="standardContextual"/>
             </w:rPr>
           </w:pPr>
-          <w:hyperlink w:anchor="_Toc227613237" w:history="1">
+          <w:hyperlink w:anchor="_Toc229766046" w:history="1">
             <w:r>
               <w:rPr>
                 <w:rStyle w:val="Hyperlink"/>
@@ -4318,7 +4318,7 @@
                 <w:noProof/>
                 <w:webHidden/>
               </w:rPr>
-              <w:instrText xml:space="preserve"> PAGEREF _Toc227613237 \h </w:instrText>
+              <w:instrText xml:space="preserve"> PAGEREF _Toc229766046 \h </w:instrText>
             </w:r>
             <w:r>
               <w:rPr>
@@ -4365,7 +4365,7 @@
               <w14:ligatures w14:val="standardContextual"/>
             </w:rPr>
           </w:pPr>
-          <w:hyperlink w:anchor="_Toc227613238" w:history="1">
+          <w:hyperlink w:anchor="_Toc229766047" w:history="1">
             <w:r>
               <w:rPr>
                 <w:rStyle w:val="Hyperlink"/>
@@ -4392,7 +4392,7 @@
                 <w:noProof/>
                 <w:webHidden/>
               </w:rPr>
-              <w:instrText xml:space="preserve"> PAGEREF _Toc227613238 \h </w:instrText>
+              <w:instrText xml:space="preserve"> PAGEREF _Toc229766047 \h </w:instrText>
             </w:r>
             <w:r>
               <w:rPr>
@@ -4452,7 +4452,7 @@
       <w:pPr>
         <w:pStyle w:val="Heading1"/>
       </w:pPr>
-      <w:bookmarkStart w:id="0" w:name="_Toc227613184"/>
+      <w:bookmarkStart w:id="0" w:name="_Toc229765993"/>
       <w:r>
         <w:lastRenderedPageBreak/>
         <w:t>I</w:t>
@@ -4579,7 +4579,17 @@
         </w:numPr>
       </w:pPr>
       <w:r>
-        <w:t>A setup.exe installer that generates then runs installation scripts that create the schema, load seed data, and compile the packages.</w:t>
+        <w:t xml:space="preserve">A </w:t>
+      </w:r>
+      <w:r>
+        <w:rPr>
+          <w:i/>
+          <w:iCs/>
+        </w:rPr>
+        <w:t>setup.exe</w:t>
+      </w:r>
+      <w:r>
+        <w:t xml:space="preserve"> installer that generates then runs installation scripts that create the schema, load seed data, and compile the packages.</w:t>
       </w:r>
     </w:p>
     <w:p>
@@ -4833,7 +4843,7 @@
       <w:pPr>
         <w:pStyle w:val="Heading1"/>
       </w:pPr>
-      <w:bookmarkStart w:id="1" w:name="_Toc227613185"/>
+      <w:bookmarkStart w:id="1" w:name="_Toc229765994"/>
       <w:r>
         <w:lastRenderedPageBreak/>
         <w:t>Oracle Database</w:t>
@@ -4845,7 +4855,7 @@
       <w:pPr>
         <w:pStyle w:val="Heading2"/>
       </w:pPr>
-      <w:bookmarkStart w:id="2" w:name="_Toc227613186"/>
+      <w:bookmarkStart w:id="2" w:name="_Toc229765995"/>
       <w:r>
         <w:t>Installing Oracle</w:t>
       </w:r>
@@ -5102,7 +5112,7 @@
       <w:pPr>
         <w:pStyle w:val="Heading2"/>
       </w:pPr>
-      <w:bookmarkStart w:id="4" w:name="_Toc227613187"/>
+      <w:bookmarkStart w:id="4" w:name="_Toc229765996"/>
       <w:r>
         <w:lastRenderedPageBreak/>
         <w:t>Managing</w:t>
@@ -5120,7 +5130,7 @@
       <w:pPr>
         <w:pStyle w:val="Heading3"/>
       </w:pPr>
-      <w:bookmarkStart w:id="5" w:name="_Toc227613188"/>
+      <w:bookmarkStart w:id="5" w:name="_Toc229765997"/>
       <w:r>
         <w:t>Starting the Oracle Service</w:t>
       </w:r>
@@ -5428,7 +5438,7 @@
         <w:pStyle w:val="Heading3"/>
       </w:pPr>
       <w:bookmarkStart w:id="6" w:name="_Toc109557349"/>
-      <w:bookmarkStart w:id="7" w:name="_Toc227613189"/>
+      <w:bookmarkStart w:id="7" w:name="_Toc229765998"/>
       <w:r>
         <w:lastRenderedPageBreak/>
         <w:t>Starting and Stopping the Database</w:t>
@@ -5733,7 +5743,7 @@
         <w:pStyle w:val="Heading3"/>
       </w:pPr>
       <w:bookmarkStart w:id="10" w:name="_Toc109557352"/>
-      <w:bookmarkStart w:id="11" w:name="_Toc227613190"/>
+      <w:bookmarkStart w:id="11" w:name="_Toc229765999"/>
       <w:r>
         <w:lastRenderedPageBreak/>
         <w:t>Net Services Listener</w:t>
@@ -5977,24 +5987,24 @@
       <w:pPr>
         <w:pStyle w:val="Heading2"/>
       </w:pPr>
-      <w:bookmarkStart w:id="12" w:name="_Toc227613191"/>
-      <w:bookmarkStart w:id="13" w:name="_Toc109557353"/>
+      <w:bookmarkStart w:id="12" w:name="_Toc109557353"/>
+      <w:bookmarkStart w:id="13" w:name="_Toc229766000"/>
       <w:r>
         <w:lastRenderedPageBreak/>
         <w:t>Developer Tools</w:t>
       </w:r>
+      <w:bookmarkEnd w:id="13"/>
+    </w:p>
+    <w:p/>
+    <w:p>
+      <w:pPr>
+        <w:pStyle w:val="Heading3"/>
+      </w:pPr>
+      <w:bookmarkStart w:id="14" w:name="_Toc229766001"/>
+      <w:r>
+        <w:t>SQL*Plus</w:t>
+      </w:r>
       <w:bookmarkEnd w:id="12"/>
-    </w:p>
-    <w:p/>
-    <w:p>
-      <w:pPr>
-        <w:pStyle w:val="Heading3"/>
-      </w:pPr>
-      <w:bookmarkStart w:id="14" w:name="_Toc227613192"/>
-      <w:r>
-        <w:t>SQL*Plus</w:t>
-      </w:r>
-      <w:bookmarkEnd w:id="13"/>
       <w:bookmarkEnd w:id="14"/>
     </w:p>
     <w:p/>
@@ -6651,7 +6661,7 @@
       <w:pPr>
         <w:pStyle w:val="Heading3"/>
       </w:pPr>
-      <w:bookmarkStart w:id="16" w:name="_Toc227613193"/>
+      <w:bookmarkStart w:id="16" w:name="_Toc229766002"/>
       <w:r>
         <w:t>SQL Developer</w:t>
       </w:r>
@@ -6764,7 +6774,7 @@
       <w:pPr>
         <w:pStyle w:val="Heading2"/>
       </w:pPr>
-      <w:bookmarkStart w:id="17" w:name="_Toc227613194"/>
+      <w:bookmarkStart w:id="17" w:name="_Toc229766003"/>
       <w:r>
         <w:lastRenderedPageBreak/>
         <w:t>Troubleshooting</w:t>
@@ -6776,7 +6786,7 @@
       <w:pPr>
         <w:pStyle w:val="Heading3"/>
       </w:pPr>
-      <w:bookmarkStart w:id="18" w:name="_Toc227613195"/>
+      <w:bookmarkStart w:id="18" w:name="_Toc229766004"/>
       <w:r>
         <w:t>Listener</w:t>
       </w:r>
@@ -6938,7 +6948,7 @@
       <w:pPr>
         <w:pStyle w:val="Heading3"/>
       </w:pPr>
-      <w:bookmarkStart w:id="19" w:name="_Toc227613196"/>
+      <w:bookmarkStart w:id="19" w:name="_Toc229766005"/>
       <w:r>
         <w:t>Checklist</w:t>
       </w:r>
@@ -7284,7 +7294,7 @@
       <w:pPr>
         <w:pStyle w:val="Heading1"/>
       </w:pPr>
-      <w:bookmarkStart w:id="20" w:name="_Toc227613197"/>
+      <w:bookmarkStart w:id="20" w:name="_Toc229766006"/>
       <w:r>
         <w:lastRenderedPageBreak/>
         <w:t>The Demo Application</w:t>
@@ -7416,7 +7426,7 @@
           </w:tcPr>
           <w:p>
             <w:r>
-              <w:t>UTIL_ADMIN</w:t>
+              <w:t>SEARCH</w:t>
             </w:r>
           </w:p>
         </w:tc>
@@ -7426,7 +7436,7 @@
           </w:tcPr>
           <w:p>
             <w:r>
-              <w:t>Application message logging and error handling.</w:t>
+              <w:t>Binary searches.</w:t>
             </w:r>
           </w:p>
         </w:tc>
@@ -7438,7 +7448,7 @@
           </w:tcPr>
           <w:p>
             <w:r>
-              <w:t xml:space="preserve">UTIL_DATE </w:t>
+              <w:t>STATS</w:t>
             </w:r>
           </w:p>
         </w:tc>
@@ -7448,7 +7458,7 @@
           </w:tcPr>
           <w:p>
             <w:r>
-              <w:t>First and last working days of month, determine if a date is a working day, Easter etc.</w:t>
+              <w:t>Calculate statistics: Mean, mode, standard deviation, percentile.</w:t>
             </w:r>
           </w:p>
         </w:tc>
@@ -7460,6 +7470,50 @@
           </w:tcPr>
           <w:p>
             <w:r>
+              <w:t>UTIL_ADMIN</w:t>
+            </w:r>
+          </w:p>
+        </w:tc>
+        <w:tc>
+          <w:tcPr>
+            <w:tcW w:w="6753" w:type="dxa"/>
+          </w:tcPr>
+          <w:p>
+            <w:r>
+              <w:t>Application message logging and error handling.</w:t>
+            </w:r>
+          </w:p>
+        </w:tc>
+      </w:tr>
+      <w:tr>
+        <w:tc>
+          <w:tcPr>
+            <w:tcW w:w="2263" w:type="dxa"/>
+          </w:tcPr>
+          <w:p>
+            <w:r>
+              <w:t xml:space="preserve">UTIL_DATE </w:t>
+            </w:r>
+          </w:p>
+        </w:tc>
+        <w:tc>
+          <w:tcPr>
+            <w:tcW w:w="6753" w:type="dxa"/>
+          </w:tcPr>
+          <w:p>
+            <w:r>
+              <w:t>First and last working days of month, determine if a date is a working day, Easter etc.</w:t>
+            </w:r>
+          </w:p>
+        </w:tc>
+      </w:tr>
+      <w:tr>
+        <w:tc>
+          <w:tcPr>
+            <w:tcW w:w="2263" w:type="dxa"/>
+          </w:tcPr>
+          <w:p>
+            <w:r>
               <w:t>UTIL_NUMERIC</w:t>
             </w:r>
           </w:p>
@@ -7470,10 +7524,13 @@
           </w:tcPr>
           <w:p>
             <w:r>
-              <w:t>Binary search, de-duplicate, factorial, calculate statistics</w:t>
-            </w:r>
-            <w:r>
-              <w:t>, sort.</w:t>
+              <w:t>D</w:t>
+            </w:r>
+            <w:r>
+              <w:t xml:space="preserve">e-duplicate, factorial, </w:t>
+            </w:r>
+            <w:r>
+              <w:t>sort.</w:t>
             </w:r>
           </w:p>
         </w:tc>
@@ -7619,7 +7676,7 @@
       <w:pPr>
         <w:pStyle w:val="Heading2"/>
       </w:pPr>
-      <w:bookmarkStart w:id="21" w:name="_Toc227613198"/>
+      <w:bookmarkStart w:id="21" w:name="_Toc229766007"/>
       <w:r>
         <w:lastRenderedPageBreak/>
         <w:t>Database Security</w:t>
@@ -7817,7 +7874,7 @@
       <w:pPr>
         <w:pStyle w:val="Heading2"/>
       </w:pPr>
-      <w:bookmarkStart w:id="22" w:name="_Toc227613199"/>
+      <w:bookmarkStart w:id="22" w:name="_Toc229766008"/>
       <w:r>
         <w:lastRenderedPageBreak/>
         <w:t>Demo Schema</w:t>
@@ -7835,7 +7892,7 @@
       <w:pPr>
         <w:pStyle w:val="Heading3"/>
       </w:pPr>
-      <w:bookmarkStart w:id="23" w:name="_Toc227613200"/>
+      <w:bookmarkStart w:id="23" w:name="_Toc229766009"/>
       <w:r>
         <w:t xml:space="preserve">Users </w:t>
       </w:r>
@@ -7991,7 +8048,7 @@
       <w:pPr>
         <w:pStyle w:val="Heading3"/>
       </w:pPr>
-      <w:bookmarkStart w:id="24" w:name="_Toc227613201"/>
+      <w:bookmarkStart w:id="24" w:name="_Toc229766010"/>
       <w:r>
         <w:t>Packages</w:t>
       </w:r>
@@ -8168,7 +8225,7 @@
           </w:tcPr>
           <w:p>
             <w:r>
-              <w:t>UTIL_ADMIN</w:t>
+              <w:t>PLSQL_TYPES</w:t>
             </w:r>
           </w:p>
         </w:tc>
@@ -8178,10 +8235,7 @@
           </w:tcPr>
           <w:p>
             <w:r>
-              <w:t>Admin functions such as standardised error handling</w:t>
-            </w:r>
-            <w:r>
-              <w:t>, log messages.</w:t>
+              <w:t>Define types shared by packages.</w:t>
             </w:r>
           </w:p>
         </w:tc>
@@ -8193,7 +8247,7 @@
           </w:tcPr>
           <w:p>
             <w:r>
-              <w:t>UTIL_DATE</w:t>
+              <w:t>SEARCH</w:t>
             </w:r>
           </w:p>
         </w:tc>
@@ -8203,8 +8257,25 @@
           </w:tcPr>
           <w:p>
             <w:r>
-              <w:t>Date manipulation functions. Date of Easter and related holidays. Is date a working day?  Last working day of month.</w:t>
-            </w:r>
+              <w:t>Binary searches; leftmost, nea</w:t>
+            </w:r>
+            <w:r>
+              <w:t xml:space="preserve">rest, predecessor, successor, </w:t>
+            </w:r>
+            <w:r>
+              <w:t>range</w:t>
+            </w:r>
+            <w:r>
+              <w:t xml:space="preserve">, </w:t>
+            </w:r>
+            <w:proofErr w:type="gramStart"/>
+            <w:r>
+              <w:t>rightmost</w:t>
+            </w:r>
+            <w:r>
+              <w:t xml:space="preserve"> .</w:t>
+            </w:r>
+            <w:proofErr w:type="gramEnd"/>
           </w:p>
         </w:tc>
       </w:tr>
@@ -8215,7 +8286,7 @@
           </w:tcPr>
           <w:p>
             <w:r>
-              <w:t>UTIL_FILE</w:t>
+              <w:t>STATS</w:t>
             </w:r>
           </w:p>
         </w:tc>
@@ -8225,7 +8296,13 @@
           </w:tcPr>
           <w:p>
             <w:r>
-              <w:t>Load data from an external CSV file into a staging table.</w:t>
+              <w:t xml:space="preserve">Count, highest, lowest, mean, median, mode, range, sum, </w:t>
+            </w:r>
+            <w:r>
+              <w:t>interquartile range</w:t>
+            </w:r>
+            <w:r>
+              <w:t>, standard deviation, percentile.</w:t>
             </w:r>
           </w:p>
         </w:tc>
@@ -8237,6 +8314,75 @@
           </w:tcPr>
           <w:p>
             <w:r>
+              <w:t>UTIL_ADMIN</w:t>
+            </w:r>
+          </w:p>
+        </w:tc>
+        <w:tc>
+          <w:tcPr>
+            <w:tcW w:w="6753" w:type="dxa"/>
+          </w:tcPr>
+          <w:p>
+            <w:r>
+              <w:t>Admin functions such as standardised error handling</w:t>
+            </w:r>
+            <w:r>
+              <w:t>, log messages.</w:t>
+            </w:r>
+          </w:p>
+        </w:tc>
+      </w:tr>
+      <w:tr>
+        <w:tc>
+          <w:tcPr>
+            <w:tcW w:w="2263" w:type="dxa"/>
+          </w:tcPr>
+          <w:p>
+            <w:r>
+              <w:t>UTIL_DATE</w:t>
+            </w:r>
+          </w:p>
+        </w:tc>
+        <w:tc>
+          <w:tcPr>
+            <w:tcW w:w="6753" w:type="dxa"/>
+          </w:tcPr>
+          <w:p>
+            <w:r>
+              <w:t>Date manipulation functions. Date of Easter and related holidays. Is date a working day?  Last working day of month.</w:t>
+            </w:r>
+          </w:p>
+        </w:tc>
+      </w:tr>
+      <w:tr>
+        <w:tc>
+          <w:tcPr>
+            <w:tcW w:w="2263" w:type="dxa"/>
+          </w:tcPr>
+          <w:p>
+            <w:r>
+              <w:t>UTIL_FILE</w:t>
+            </w:r>
+          </w:p>
+        </w:tc>
+        <w:tc>
+          <w:tcPr>
+            <w:tcW w:w="6753" w:type="dxa"/>
+          </w:tcPr>
+          <w:p>
+            <w:r>
+              <w:t>Load data from an external CSV file into a staging table.</w:t>
+            </w:r>
+          </w:p>
+        </w:tc>
+      </w:tr>
+      <w:tr>
+        <w:tc>
+          <w:tcPr>
+            <w:tcW w:w="2263" w:type="dxa"/>
+          </w:tcPr>
+          <w:p>
+            <w:r>
               <w:t>UTIL_NUMERIC</w:t>
             </w:r>
           </w:p>
@@ -8247,7 +8393,16 @@
           </w:tcPr>
           <w:p>
             <w:r>
-              <w:t>Base conversion, binary search, convert integer to alphabetic code (Excel column label), de-duplicate, factorial, sort, statistics.</w:t>
+              <w:t>Base conversion, convert integer to alph</w:t>
+            </w:r>
+            <w:r>
+              <w:t>anumeric</w:t>
+            </w:r>
+            <w:r>
+              <w:t xml:space="preserve"> code (Excel column label), de-duplicate, factorial, sort</w:t>
+            </w:r>
+            <w:r>
+              <w:t>ing.</w:t>
             </w:r>
           </w:p>
         </w:tc>
@@ -8293,7 +8448,7 @@
       <w:pPr>
         <w:pStyle w:val="Heading3"/>
       </w:pPr>
-      <w:bookmarkStart w:id="25" w:name="_Toc227613202"/>
+      <w:bookmarkStart w:id="25" w:name="_Toc229766011"/>
       <w:r>
         <w:lastRenderedPageBreak/>
         <w:t>Tables</w:t>
@@ -8905,7 +9060,7 @@
       <w:pPr>
         <w:pStyle w:val="Heading2"/>
       </w:pPr>
-      <w:bookmarkStart w:id="26" w:name="_Toc227613203"/>
+      <w:bookmarkStart w:id="26" w:name="_Toc229766012"/>
       <w:r>
         <w:lastRenderedPageBreak/>
         <w:t>Directories</w:t>
@@ -9292,7 +9447,7 @@
       <w:pPr>
         <w:pStyle w:val="Heading2"/>
       </w:pPr>
-      <w:bookmarkStart w:id="27" w:name="_Toc227613204"/>
+      <w:bookmarkStart w:id="27" w:name="_Toc229766013"/>
       <w:r>
         <w:t>Source Code Templates</w:t>
       </w:r>
@@ -9501,7 +9656,7 @@
       <w:pPr>
         <w:pStyle w:val="Heading2"/>
       </w:pPr>
-      <w:bookmarkStart w:id="28" w:name="_Toc227613205"/>
+      <w:bookmarkStart w:id="28" w:name="_Toc229766014"/>
       <w:r>
         <w:lastRenderedPageBreak/>
         <w:t>Installing the Demo Application</w:t>
@@ -11539,7 +11694,7 @@
       <w:pPr>
         <w:pStyle w:val="Heading2"/>
       </w:pPr>
-      <w:bookmarkStart w:id="29" w:name="_Toc227613206"/>
+      <w:bookmarkStart w:id="29" w:name="_Toc229766015"/>
       <w:r>
         <w:t>Getting Started</w:t>
       </w:r>
@@ -12093,7 +12248,7 @@
       <w:pPr>
         <w:pStyle w:val="Heading3"/>
       </w:pPr>
-      <w:bookmarkStart w:id="30" w:name="_Toc227613207"/>
+      <w:bookmarkStart w:id="30" w:name="_Toc229766016"/>
       <w:r>
         <w:lastRenderedPageBreak/>
         <w:t>SQL Developer</w:t>
@@ -12256,7 +12411,7 @@
       <w:pPr>
         <w:pStyle w:val="Heading3"/>
       </w:pPr>
-      <w:bookmarkStart w:id="31" w:name="_Toc227613208"/>
+      <w:bookmarkStart w:id="31" w:name="_Toc229766017"/>
       <w:r>
         <w:lastRenderedPageBreak/>
         <w:t>Accessing the Demo Schema</w:t>
@@ -12702,7 +12857,7 @@
       <w:pPr>
         <w:pStyle w:val="Heading2"/>
       </w:pPr>
-      <w:bookmarkStart w:id="32" w:name="_Toc227613209"/>
+      <w:bookmarkStart w:id="32" w:name="_Toc229766018"/>
       <w:r>
         <w:lastRenderedPageBreak/>
         <w:t>Sales Order Import</w:t>
@@ -13430,6 +13585,9 @@
         </w:rPr>
       </w:pPr>
       <w:r>
+        <w:rPr>
+          <w:noProof/>
+        </w:rPr>
         <w:drawing>
           <wp:inline distT="0" distB="0" distL="0" distR="0" wp14:anchorId="33ABE566" wp14:editId="4F4C6CD4">
             <wp:extent cx="5731510" cy="2671445"/>
@@ -13472,6 +13630,7 @@
           <w:bCs/>
           <w:i/>
           <w:iCs/>
+          <w:noProof/>
         </w:rPr>
         <w:drawing>
           <wp:inline distT="0" distB="0" distL="0" distR="0" wp14:anchorId="4511D7D7" wp14:editId="744F2537">
@@ -14086,7 +14245,7 @@
       <w:pPr>
         <w:pStyle w:val="Heading1"/>
       </w:pPr>
-      <w:bookmarkStart w:id="34" w:name="_Toc227613210"/>
+      <w:bookmarkStart w:id="34" w:name="_Toc229766019"/>
       <w:r>
         <w:lastRenderedPageBreak/>
         <w:t>Application Development</w:t>
@@ -14337,7 +14496,10 @@
         <w:t>Source Control Management: Git</w:t>
       </w:r>
       <w:r>
-        <w:t>, Subversion.</w:t>
+        <w:t>, Subversion</w:t>
+      </w:r>
+      <w:r>
+        <w:t xml:space="preserve"> (both integrated with SQL Developer).</w:t>
       </w:r>
     </w:p>
     <w:p>
@@ -14593,15 +14755,15 @@
         <w:pStyle w:val="Heading2"/>
       </w:pPr>
       <w:bookmarkStart w:id="35" w:name="_Toc111364625"/>
-      <w:bookmarkStart w:id="36" w:name="_Toc227613211"/>
-      <w:bookmarkStart w:id="37" w:name="_Toc80305905"/>
-      <w:bookmarkStart w:id="38" w:name="_Toc80305901"/>
+      <w:bookmarkStart w:id="36" w:name="_Toc80305905"/>
+      <w:bookmarkStart w:id="37" w:name="_Toc80305901"/>
+      <w:bookmarkStart w:id="38" w:name="_Toc229766020"/>
       <w:r>
         <w:lastRenderedPageBreak/>
         <w:t>Systems Development Life Cycle</w:t>
       </w:r>
       <w:bookmarkEnd w:id="35"/>
-      <w:bookmarkEnd w:id="36"/>
+      <w:bookmarkEnd w:id="38"/>
     </w:p>
     <w:p/>
     <w:p>
@@ -14738,7 +14900,7 @@
         <w:pStyle w:val="Heading3"/>
       </w:pPr>
       <w:bookmarkStart w:id="39" w:name="_Toc111364626"/>
-      <w:bookmarkStart w:id="40" w:name="_Toc227613212"/>
+      <w:bookmarkStart w:id="40" w:name="_Toc229766021"/>
       <w:r>
         <w:t>Planning</w:t>
       </w:r>
@@ -14763,7 +14925,7 @@
         <w:pStyle w:val="Heading3"/>
       </w:pPr>
       <w:bookmarkStart w:id="41" w:name="_Toc111364627"/>
-      <w:bookmarkStart w:id="42" w:name="_Toc227613213"/>
+      <w:bookmarkStart w:id="42" w:name="_Toc229766022"/>
       <w:r>
         <w:t>Analysis</w:t>
       </w:r>
@@ -14850,7 +15012,7 @@
         <w:pStyle w:val="Heading3"/>
       </w:pPr>
       <w:bookmarkStart w:id="43" w:name="_Toc111364628"/>
-      <w:bookmarkStart w:id="44" w:name="_Toc227613214"/>
+      <w:bookmarkStart w:id="44" w:name="_Toc229766023"/>
       <w:r>
         <w:lastRenderedPageBreak/>
         <w:t>Design</w:t>
@@ -14973,7 +15135,7 @@
         <w:pStyle w:val="Heading3"/>
       </w:pPr>
       <w:bookmarkStart w:id="45" w:name="_Toc111364629"/>
-      <w:bookmarkStart w:id="46" w:name="_Toc227613215"/>
+      <w:bookmarkStart w:id="46" w:name="_Toc229766024"/>
       <w:r>
         <w:t>Development</w:t>
       </w:r>
@@ -15067,7 +15229,7 @@
         <w:pStyle w:val="Heading3"/>
       </w:pPr>
       <w:bookmarkStart w:id="48" w:name="_Toc111364630"/>
-      <w:bookmarkStart w:id="49" w:name="_Toc227613216"/>
+      <w:bookmarkStart w:id="49" w:name="_Toc229766025"/>
       <w:r>
         <w:t>Testing</w:t>
       </w:r>
@@ -15107,7 +15269,7 @@
         <w:pStyle w:val="Heading3"/>
       </w:pPr>
       <w:bookmarkStart w:id="51" w:name="_Toc111364631"/>
-      <w:bookmarkStart w:id="52" w:name="_Toc227613217"/>
+      <w:bookmarkStart w:id="52" w:name="_Toc229766026"/>
       <w:r>
         <w:lastRenderedPageBreak/>
         <w:t>Implementation</w:t>
@@ -15184,7 +15346,7 @@
         <w:pStyle w:val="Heading3"/>
       </w:pPr>
       <w:bookmarkStart w:id="54" w:name="_Toc111364632"/>
-      <w:bookmarkStart w:id="55" w:name="_Toc227613218"/>
+      <w:bookmarkStart w:id="55" w:name="_Toc229766027"/>
       <w:r>
         <w:t>Maintenance</w:t>
       </w:r>
@@ -15223,15 +15385,15 @@
       </w:pPr>
       <w:bookmarkStart w:id="57" w:name="_Documentation"/>
       <w:bookmarkStart w:id="58" w:name="_Toc111364633"/>
-      <w:bookmarkStart w:id="59" w:name="_Toc227613219"/>
-      <w:bookmarkStart w:id="60" w:name="_Toc79869444"/>
+      <w:bookmarkStart w:id="59" w:name="_Toc79869444"/>
+      <w:bookmarkStart w:id="60" w:name="_Toc229766028"/>
       <w:bookmarkEnd w:id="57"/>
       <w:r>
         <w:lastRenderedPageBreak/>
         <w:t>Documentation</w:t>
       </w:r>
       <w:bookmarkEnd w:id="58"/>
-      <w:bookmarkEnd w:id="59"/>
+      <w:bookmarkEnd w:id="60"/>
     </w:p>
     <w:p/>
     <w:p>
@@ -15416,12 +15578,12 @@
         <w:pStyle w:val="Heading2"/>
       </w:pPr>
       <w:bookmarkStart w:id="61" w:name="_Toc111364634"/>
-      <w:bookmarkStart w:id="62" w:name="_Toc227613220"/>
+      <w:bookmarkStart w:id="62" w:name="_Toc229766029"/>
       <w:r>
         <w:lastRenderedPageBreak/>
         <w:t>Release Management</w:t>
       </w:r>
-      <w:bookmarkEnd w:id="60"/>
+      <w:bookmarkEnd w:id="59"/>
       <w:bookmarkEnd w:id="61"/>
       <w:bookmarkEnd w:id="62"/>
     </w:p>
@@ -15439,7 +15601,7 @@
       <w:bookmarkStart w:id="63" w:name="_Deployment_Environments"/>
       <w:bookmarkStart w:id="64" w:name="_Toc79869445"/>
       <w:bookmarkStart w:id="65" w:name="_Toc111364635"/>
-      <w:bookmarkStart w:id="66" w:name="_Toc227613221"/>
+      <w:bookmarkStart w:id="66" w:name="_Toc229766030"/>
       <w:bookmarkEnd w:id="63"/>
       <w:r>
         <w:t>Deployment Environments</w:t>
@@ -15503,7 +15665,7 @@
         <w:pStyle w:val="Heading2"/>
       </w:pPr>
       <w:bookmarkStart w:id="67" w:name="_Toc111364636"/>
-      <w:bookmarkStart w:id="68" w:name="_Toc227613222"/>
+      <w:bookmarkStart w:id="68" w:name="_Toc229766031"/>
       <w:r>
         <w:t>Source Control Management</w:t>
       </w:r>
@@ -15516,10 +15678,41 @@
         <w:t xml:space="preserve">Source Control Management tools allow you track and manage changes to software. </w:t>
       </w:r>
     </w:p>
-    <w:p/>
-    <w:p>
-      <w:r>
-        <w:t xml:space="preserve">The source code is stored in a repository, which retains a history of each version as changes are made. Developers check out code to work on, and check the new version of the source code back into the repository when it is ready to be deployed into the production system. </w:t>
+    <w:p>
+      <w:r>
+        <w:t>The source code is stored in a repository, which retains a history of each version as changes are made</w:t>
+      </w:r>
+      <w:r>
+        <w:t xml:space="preserve">, </w:t>
+      </w:r>
+      <w:r>
+        <w:t>enabling easy reversion to previous versions and efficient management of code modifications.</w:t>
+      </w:r>
+    </w:p>
+    <w:p>
+      <w:r>
+        <w:t>A distributed version control system, such as Git, gives maximum flexibility</w:t>
+      </w:r>
+      <w:r>
+        <w:t>.</w:t>
+      </w:r>
+      <w:r>
+        <w:t xml:space="preserve"> </w:t>
+      </w:r>
+      <w:r>
+        <w:t>Git allow</w:t>
+      </w:r>
+      <w:r>
+        <w:t>s</w:t>
+      </w:r>
+      <w:r>
+        <w:t xml:space="preserve"> multiple developers to work on the same project simultaneously</w:t>
+      </w:r>
+      <w:r>
+        <w:t>. Developers can work without having to be permanently connected to a central repository.</w:t>
+      </w:r>
+      <w:r>
+        <w:t xml:space="preserve"> An additional benefit is that even if one repository is lost, it can be cloned from another repository.</w:t>
       </w:r>
     </w:p>
     <w:p>
@@ -15539,12 +15732,12 @@
       <w:pPr>
         <w:pStyle w:val="Heading2"/>
       </w:pPr>
-      <w:bookmarkStart w:id="69" w:name="_Toc227613223"/>
+      <w:bookmarkStart w:id="69" w:name="_Toc229766032"/>
       <w:r>
         <w:lastRenderedPageBreak/>
         <w:t>Modular Database Applications</w:t>
       </w:r>
-      <w:bookmarkEnd w:id="37"/>
+      <w:bookmarkEnd w:id="36"/>
       <w:bookmarkEnd w:id="69"/>
     </w:p>
     <w:p/>
@@ -15651,7 +15844,7 @@
         <w:pStyle w:val="Heading2"/>
       </w:pPr>
       <w:bookmarkStart w:id="70" w:name="_Toc80305906"/>
-      <w:bookmarkStart w:id="71" w:name="_Toc227613224"/>
+      <w:bookmarkStart w:id="71" w:name="_Toc229766033"/>
       <w:r>
         <w:t>Client Server Architecture</w:t>
       </w:r>
@@ -15739,7 +15932,7 @@
       <w:pPr>
         <w:pStyle w:val="Heading2"/>
       </w:pPr>
-      <w:bookmarkStart w:id="72" w:name="_Toc227613225"/>
+      <w:bookmarkStart w:id="72" w:name="_Toc229766034"/>
       <w:r>
         <w:lastRenderedPageBreak/>
         <w:t>Database Design</w:t>
@@ -15756,8 +15949,8 @@
         <w:pStyle w:val="Heading3"/>
       </w:pPr>
       <w:bookmarkStart w:id="73" w:name="_Normalizaton"/>
-      <w:bookmarkStart w:id="74" w:name="_Toc227613226"/>
-      <w:bookmarkStart w:id="75" w:name="_Hlk111364307"/>
+      <w:bookmarkStart w:id="74" w:name="_Hlk111364307"/>
+      <w:bookmarkStart w:id="75" w:name="_Toc229766035"/>
       <w:bookmarkEnd w:id="73"/>
       <w:r>
         <w:t>Normalizat</w:t>
@@ -15768,7 +15961,7 @@
       <w:r>
         <w:t>on</w:t>
       </w:r>
-      <w:bookmarkEnd w:id="74"/>
+      <w:bookmarkEnd w:id="75"/>
     </w:p>
     <w:p>
       <w:pPr>
@@ -23080,7 +23273,7 @@
     <w:p/>
     <w:p>
       <w:bookmarkStart w:id="78" w:name="_Toc110878101"/>
-      <w:bookmarkEnd w:id="75"/>
+      <w:bookmarkEnd w:id="74"/>
       <w:r>
         <w:rPr>
           <w:noProof/>
@@ -23200,7 +23393,7 @@
         <w:pStyle w:val="Heading3"/>
       </w:pPr>
       <w:bookmarkStart w:id="79" w:name="_Indexes_and_Performance"/>
-      <w:bookmarkStart w:id="80" w:name="_Toc227613227"/>
+      <w:bookmarkStart w:id="80" w:name="_Toc229766036"/>
       <w:bookmarkEnd w:id="79"/>
       <w:r>
         <w:lastRenderedPageBreak/>
@@ -23236,7 +23429,7 @@
         <w:pStyle w:val="Heading3"/>
       </w:pPr>
       <w:bookmarkStart w:id="81" w:name="_Indexes:_Surrogate_vs"/>
-      <w:bookmarkStart w:id="82" w:name="_Toc227613228"/>
+      <w:bookmarkStart w:id="82" w:name="_Toc229766037"/>
       <w:bookmarkEnd w:id="81"/>
       <w:r>
         <w:t>Surrogate vs Natural</w:t>
@@ -24231,7 +24424,7 @@
         <w:pStyle w:val="Heading3"/>
       </w:pPr>
       <w:bookmarkStart w:id="84" w:name="_Constraints"/>
-      <w:bookmarkStart w:id="85" w:name="_Toc227613229"/>
+      <w:bookmarkStart w:id="85" w:name="_Toc229766038"/>
       <w:bookmarkEnd w:id="84"/>
       <w:r>
         <w:lastRenderedPageBreak/>
@@ -24460,7 +24653,7 @@
         <w:pStyle w:val="Heading2"/>
       </w:pPr>
       <w:bookmarkStart w:id="86" w:name="_Coding_Standards"/>
-      <w:bookmarkStart w:id="87" w:name="_Toc227613230"/>
+      <w:bookmarkStart w:id="87" w:name="_Toc229766039"/>
       <w:bookmarkEnd w:id="86"/>
       <w:r>
         <w:lastRenderedPageBreak/>
@@ -24473,11 +24666,11 @@
       <w:pPr>
         <w:pStyle w:val="Heading3"/>
       </w:pPr>
-      <w:bookmarkStart w:id="88" w:name="_Toc227613231"/>
+      <w:bookmarkStart w:id="88" w:name="_Toc229766040"/>
       <w:r>
         <w:t>Golden Rules</w:t>
       </w:r>
-      <w:bookmarkEnd w:id="38"/>
+      <w:bookmarkEnd w:id="37"/>
       <w:r>
         <w:t xml:space="preserve"> for Software Development</w:t>
       </w:r>
@@ -24605,7 +24798,7 @@
       </w:pPr>
       <w:bookmarkStart w:id="89" w:name="_Naming_Conventions"/>
       <w:bookmarkStart w:id="90" w:name="_Toc80305902"/>
-      <w:bookmarkStart w:id="91" w:name="_Toc227613232"/>
+      <w:bookmarkStart w:id="91" w:name="_Toc229766041"/>
       <w:bookmarkEnd w:id="89"/>
       <w:r>
         <w:lastRenderedPageBreak/>
@@ -25582,7 +25775,7 @@
         <w:br w:type="page"/>
       </w:r>
     </w:p>
-    <w:bookmarkStart w:id="94" w:name="_Toc227613233" w:displacedByCustomXml="next"/>
+    <w:bookmarkStart w:id="94" w:name="_Toc229766042" w:displacedByCustomXml="next"/>
     <w:sdt>
       <w:sdtPr>
         <w:rPr>
@@ -25751,7 +25944,7 @@
             <w:pStyle w:val="Heading2"/>
           </w:pPr>
           <w:bookmarkStart w:id="99" w:name="_PL/SQL_Programming_Tips_1"/>
-          <w:bookmarkStart w:id="100" w:name="_Toc227613234"/>
+          <w:bookmarkStart w:id="100" w:name="_Toc229766043"/>
           <w:bookmarkEnd w:id="99"/>
           <w:r>
             <w:lastRenderedPageBreak/>
@@ -25830,8 +26023,22 @@
             </w:numPr>
           </w:pPr>
           <w:r>
-            <w:t xml:space="preserve">Define types that are not derived from table columns in a package, for example: </w:t>
+            <w:t xml:space="preserve">Define types that are not derived from table columns in </w:t>
           </w:r>
+          <w:r>
+            <w:t>packages</w:t>
+          </w:r>
+          <w:r>
+            <w:t>. By putting commonly used types together in a single package that is referenced by many other packages, it makes maintenance far easier. For example:</w:t>
+          </w:r>
+        </w:p>
+        <w:p>
+          <w:pPr>
+            <w:numPr>
+              <w:ilvl w:val="1"/>
+              <w:numId w:val="6"/>
+            </w:numPr>
+          </w:pPr>
           <w:proofErr w:type="spellStart"/>
           <w:r>
             <w:rPr>
@@ -25849,7 +26056,35 @@
             <w:t xml:space="preserve"> </w:t>
           </w:r>
           <w:r>
-            <w:t>so that they’re all in one place, and easy to change if required.</w:t>
+            <w:rPr>
+              <w:i/>
+              <w:iCs/>
+            </w:rPr>
+            <w:t>– for constant datatypes</w:t>
+          </w:r>
+        </w:p>
+        <w:p>
+          <w:pPr>
+            <w:numPr>
+              <w:ilvl w:val="1"/>
+              <w:numId w:val="6"/>
+            </w:numPr>
+          </w:pPr>
+          <w:proofErr w:type="spellStart"/>
+          <w:r>
+            <w:rPr>
+              <w:i/>
+              <w:iCs/>
+            </w:rPr>
+            <w:t>plsql_types</w:t>
+          </w:r>
+          <w:proofErr w:type="spellEnd"/>
+          <w:r>
+            <w:rPr>
+              <w:i/>
+              <w:iCs/>
+            </w:rPr>
+            <w:t xml:space="preserve"> – TYPE definitions for variable data</w:t>
           </w:r>
         </w:p>
         <w:p>
@@ -25963,7 +26198,7 @@
             <w:pStyle w:val="Heading3"/>
           </w:pPr>
           <w:bookmarkStart w:id="101" w:name="_Toc80305909"/>
-          <w:bookmarkStart w:id="102" w:name="_Toc227613235"/>
+          <w:bookmarkStart w:id="102" w:name="_Toc229766044"/>
           <w:r>
             <w:lastRenderedPageBreak/>
             <w:t>Packages</w:t>
@@ -26046,6 +26281,24 @@
         </w:p>
         <w:p>
           <w:pPr>
+            <w:pStyle w:val="ListParagraph"/>
+            <w:numPr>
+              <w:ilvl w:val="0"/>
+              <w:numId w:val="5"/>
+            </w:numPr>
+            <w:rPr>
+              <w:rFonts w:cs="Calibri"/>
+            </w:rPr>
+          </w:pPr>
+          <w:r>
+            <w:rPr>
+              <w:rFonts w:cs="Calibri"/>
+            </w:rPr>
+            <w:t xml:space="preserve">Avoid putting too many functions and procedures into a single package, as this makes maintenance more difficult. </w:t>
+          </w:r>
+        </w:p>
+        <w:p>
+          <w:pPr>
             <w:rPr>
               <w:rFonts w:cs="Calibri"/>
             </w:rPr>
@@ -26064,7 +26317,7 @@
             </w:rPr>
           </w:pPr>
           <w:bookmarkStart w:id="103" w:name="_Toc80305910"/>
-          <w:bookmarkStart w:id="104" w:name="_Toc227613236"/>
+          <w:bookmarkStart w:id="104" w:name="_Toc229766045"/>
           <w:r>
             <w:t>Functions</w:t>
           </w:r>
@@ -26550,6 +26803,7 @@
             <w:rPr>
               <w:rFonts w:cs="Calibri"/>
             </w:rPr>
+            <w:lastRenderedPageBreak/>
             <w:t xml:space="preserve">You would just need to alter the </w:t>
           </w:r>
           <w:proofErr w:type="spellStart"/>
@@ -26587,9 +26841,8 @@
             </w:rPr>
           </w:pPr>
           <w:bookmarkStart w:id="105" w:name="_Toc80305911"/>
-          <w:bookmarkStart w:id="106" w:name="_Toc227613237"/>
+          <w:bookmarkStart w:id="106" w:name="_Toc229766046"/>
           <w:r>
-            <w:lastRenderedPageBreak/>
             <w:t>Data Typing</w:t>
           </w:r>
           <w:bookmarkEnd w:id="105"/>
@@ -26633,26 +26886,12 @@
               <w:rFonts w:cs="Calibri"/>
             </w:rPr>
           </w:pPr>
-        </w:p>
-        <w:p>
-          <w:pPr>
-            <w:rPr>
-              <w:rFonts w:cs="Calibri"/>
-            </w:rPr>
-          </w:pPr>
           <w:r>
             <w:rPr>
               <w:rFonts w:cs="Calibri"/>
             </w:rPr>
             <w:t>For example, a variable to hold a person’s name, set to a fixed length of characters. What if the associated column in the database is altered in the future and its new length exceeds your variable’s declared length?</w:t>
           </w:r>
-        </w:p>
-        <w:p>
-          <w:pPr>
-            <w:rPr>
-              <w:rFonts w:cs="Calibri"/>
-            </w:rPr>
-          </w:pPr>
         </w:p>
         <w:p>
           <w:pPr>
@@ -26791,7 +27030,7 @@
             <w:pStyle w:val="Heading3"/>
           </w:pPr>
           <w:bookmarkStart w:id="107" w:name="_Toc80305912"/>
-          <w:bookmarkStart w:id="108" w:name="_Toc227613238"/>
+          <w:bookmarkStart w:id="108" w:name="_Toc229766047"/>
           <w:r>
             <w:t>Performance</w:t>
           </w:r>
@@ -26852,26 +27091,18 @@
               <w:rFonts w:cs="Calibri"/>
             </w:rPr>
           </w:pPr>
-        </w:p>
-        <w:p>
-          <w:pPr>
-            <w:rPr>
-              <w:rFonts w:cs="Calibri"/>
-            </w:rPr>
-          </w:pPr>
           <w:r>
             <w:rPr>
               <w:rFonts w:cs="Calibri"/>
             </w:rPr>
-            <w:t>With Oracle 8i and above, replace cursor FOR loops with the much faster BULK COLLECT query.</w:t>
+            <w:t>Wi</w:t>
           </w:r>
-        </w:p>
-        <w:p>
-          <w:pPr>
+          <w:r>
             <w:rPr>
               <w:rFonts w:cs="Calibri"/>
             </w:rPr>
-          </w:pPr>
+            <w:t>th Oracle 8i and above, replace cursor FOR loops with the much faster BULK COLLECT query.</w:t>
+          </w:r>
         </w:p>
         <w:p>
           <w:pPr>
@@ -26892,13 +27123,6 @@
               <w:rFonts w:cs="Calibri"/>
             </w:rPr>
           </w:pPr>
-        </w:p>
-        <w:p>
-          <w:pPr>
-            <w:rPr>
-              <w:rFonts w:cs="Calibri"/>
-            </w:rPr>
-          </w:pPr>
           <w:r>
             <w:rPr>
               <w:rFonts w:cs="Calibri"/>
@@ -26912,26 +27136,12 @@
               <w:rFonts w:cs="Calibri"/>
             </w:rPr>
           </w:pPr>
-        </w:p>
-        <w:p>
-          <w:pPr>
-            <w:rPr>
-              <w:rFonts w:cs="Calibri"/>
-            </w:rPr>
-          </w:pPr>
           <w:r>
             <w:rPr>
               <w:rFonts w:cs="Calibri"/>
             </w:rPr>
             <w:t>Take great care with this – Bulk Collect sacrifices memory for speed. All your collected data is stored in memory, and you then use FORALL to process the data. If you have tables with millions of rows Bulk Collect could cause severe memory problems.</w:t>
           </w:r>
-        </w:p>
-        <w:p>
-          <w:pPr>
-            <w:rPr>
-              <w:rFonts w:cs="Calibri"/>
-            </w:rPr>
-          </w:pPr>
         </w:p>
         <w:p>
           <w:pPr>
@@ -31710,7 +31920,7 @@
         <w:ind w:left="720" w:hanging="360"/>
       </w:pPr>
     </w:lvl>
-    <w:lvl w:ilvl="1" w:tplc="08090019" w:tentative="1">
+    <w:lvl w:ilvl="1" w:tplc="08090019">
       <w:start w:val="1"/>
       <w:numFmt w:val="lowerLetter"/>
       <w:lvlText w:val="%2."/>
@@ -33713,6 +33923,7 @@
     <w:rsid w:val="00680A18"/>
     <w:rsid w:val="006858A1"/>
     <w:rsid w:val="006C699C"/>
+    <w:rsid w:val="006D0C44"/>
     <w:rsid w:val="007442D1"/>
     <w:rsid w:val="0075683E"/>
     <w:rsid w:val="00764BFE"/>
@@ -33724,6 +33935,7 @@
     <w:rsid w:val="007F4869"/>
     <w:rsid w:val="0082232D"/>
     <w:rsid w:val="00824F03"/>
+    <w:rsid w:val="00836172"/>
     <w:rsid w:val="00850D14"/>
     <w:rsid w:val="00880F6D"/>
     <w:rsid w:val="008937AE"/>
@@ -33754,6 +33966,7 @@
     <w:rsid w:val="00C004F3"/>
     <w:rsid w:val="00C012F1"/>
     <w:rsid w:val="00C219E2"/>
+    <w:rsid w:val="00C622E8"/>
     <w:rsid w:val="00C63A22"/>
     <w:rsid w:val="00C67D33"/>
     <w:rsid w:val="00C97496"/>
@@ -34520,7 +34733,7 @@
 
 <file path=customXml/item1.xml><?xml version="1.0" encoding="utf-8"?>
 <CoverPageProperties xmlns="http://schemas.microsoft.com/office/2006/coverPageProps">
-  <PublishDate>2026-04-12T00:00:00</PublishDate>
+  <PublishDate>2026-05-15T00:00:00</PublishDate>
   <Abstract/>
   <CompanyAddress/>
   <CompanyPhone/>

</xml_diff>

<commit_message>
Update Read Me, remove APPSDEMO.zip
</commit_message>
<xml_diff>
--- a/documentation/Read Me.docx
+++ b/documentation/Read Me.docx
@@ -4670,7 +4670,13 @@
         </w:numPr>
       </w:pPr>
       <w:r>
-        <w:t>A simple application to import data into, and export data from the database using CSV files.</w:t>
+        <w:t>A</w:t>
+      </w:r>
+      <w:r>
+        <w:t xml:space="preserve">n </w:t>
+      </w:r>
+      <w:r>
+        <w:t>application to import data into, and export data from the database using CSV files.</w:t>
       </w:r>
     </w:p>
     <w:p>
@@ -5987,24 +5993,24 @@
       <w:pPr>
         <w:pStyle w:val="Heading2"/>
       </w:pPr>
-      <w:bookmarkStart w:id="12" w:name="_Toc109557353"/>
-      <w:bookmarkStart w:id="13" w:name="_Toc229766000"/>
+      <w:bookmarkStart w:id="12" w:name="_Toc229766000"/>
+      <w:bookmarkStart w:id="13" w:name="_Toc109557353"/>
       <w:r>
         <w:lastRenderedPageBreak/>
         <w:t>Developer Tools</w:t>
       </w:r>
+      <w:bookmarkEnd w:id="12"/>
+    </w:p>
+    <w:p/>
+    <w:p>
+      <w:pPr>
+        <w:pStyle w:val="Heading3"/>
+      </w:pPr>
+      <w:bookmarkStart w:id="14" w:name="_Toc229766001"/>
+      <w:r>
+        <w:t>SQL*Plus</w:t>
+      </w:r>
       <w:bookmarkEnd w:id="13"/>
-    </w:p>
-    <w:p/>
-    <w:p>
-      <w:pPr>
-        <w:pStyle w:val="Heading3"/>
-      </w:pPr>
-      <w:bookmarkStart w:id="14" w:name="_Toc229766001"/>
-      <w:r>
-        <w:t>SQL*Plus</w:t>
-      </w:r>
-      <w:bookmarkEnd w:id="12"/>
       <w:bookmarkEnd w:id="14"/>
     </w:p>
     <w:p/>
@@ -8260,20 +8266,11 @@
               <w:t>Binary searches; leftmost, nea</w:t>
             </w:r>
             <w:r>
-              <w:t xml:space="preserve">rest, predecessor, successor, </w:t>
-            </w:r>
-            <w:r>
-              <w:t>range</w:t>
-            </w:r>
-            <w:r>
-              <w:t xml:space="preserve">, </w:t>
+              <w:t xml:space="preserve">rest, predecessor, successor, range, </w:t>
             </w:r>
             <w:proofErr w:type="gramStart"/>
             <w:r>
-              <w:t>rightmost</w:t>
-            </w:r>
-            <w:r>
-              <w:t xml:space="preserve"> .</w:t>
+              <w:t>rightmost .</w:t>
             </w:r>
             <w:proofErr w:type="gramEnd"/>
           </w:p>
@@ -9435,7 +9432,10 @@
           </w:tcPr>
           <w:p>
             <w:r>
-              <w:t>Scripts and SQL to test programs, automated test scripts</w:t>
+              <w:t xml:space="preserve">SQL </w:t>
+            </w:r>
+            <w:r>
+              <w:t>Scripts to test programs, automated test scripts</w:t>
             </w:r>
           </w:p>
         </w:tc>
@@ -9684,7 +9684,7 @@
         <w:t xml:space="preserve">Download </w:t>
       </w:r>
       <w:r>
-        <w:t>the demo application either from the GitHub repository or Bond &amp; Pollard Website.</w:t>
+        <w:t>the demo application from the GitHub repository or Bond &amp; Pollard Website.</w:t>
       </w:r>
     </w:p>
     <w:p>
@@ -9710,7 +9710,7 @@
           <w:rPr>
             <w:rStyle w:val="Hyperlink"/>
           </w:rPr>
-          <w:t>http://www.bondpollard.co.uk/documents/APPSDEMO.zip</w:t>
+          <w:t>http://www.bondpollard.co.uk/</w:t>
         </w:r>
       </w:hyperlink>
     </w:p>
@@ -14755,15 +14755,15 @@
         <w:pStyle w:val="Heading2"/>
       </w:pPr>
       <w:bookmarkStart w:id="35" w:name="_Toc111364625"/>
-      <w:bookmarkStart w:id="36" w:name="_Toc80305905"/>
-      <w:bookmarkStart w:id="37" w:name="_Toc80305901"/>
-      <w:bookmarkStart w:id="38" w:name="_Toc229766020"/>
+      <w:bookmarkStart w:id="36" w:name="_Toc229766020"/>
+      <w:bookmarkStart w:id="37" w:name="_Toc80305905"/>
+      <w:bookmarkStart w:id="38" w:name="_Toc80305901"/>
       <w:r>
         <w:lastRenderedPageBreak/>
         <w:t>Systems Development Life Cycle</w:t>
       </w:r>
       <w:bookmarkEnd w:id="35"/>
-      <w:bookmarkEnd w:id="38"/>
+      <w:bookmarkEnd w:id="36"/>
     </w:p>
     <w:p/>
     <w:p>
@@ -15385,15 +15385,15 @@
       </w:pPr>
       <w:bookmarkStart w:id="57" w:name="_Documentation"/>
       <w:bookmarkStart w:id="58" w:name="_Toc111364633"/>
-      <w:bookmarkStart w:id="59" w:name="_Toc79869444"/>
-      <w:bookmarkStart w:id="60" w:name="_Toc229766028"/>
+      <w:bookmarkStart w:id="59" w:name="_Toc229766028"/>
+      <w:bookmarkStart w:id="60" w:name="_Toc79869444"/>
       <w:bookmarkEnd w:id="57"/>
       <w:r>
         <w:lastRenderedPageBreak/>
         <w:t>Documentation</w:t>
       </w:r>
       <w:bookmarkEnd w:id="58"/>
-      <w:bookmarkEnd w:id="60"/>
+      <w:bookmarkEnd w:id="59"/>
     </w:p>
     <w:p/>
     <w:p>
@@ -15583,7 +15583,7 @@
         <w:lastRenderedPageBreak/>
         <w:t>Release Management</w:t>
       </w:r>
-      <w:bookmarkEnd w:id="59"/>
+      <w:bookmarkEnd w:id="60"/>
       <w:bookmarkEnd w:id="61"/>
       <w:bookmarkEnd w:id="62"/>
     </w:p>
@@ -15697,10 +15697,7 @@
         <w:t>.</w:t>
       </w:r>
       <w:r>
-        <w:t xml:space="preserve"> </w:t>
-      </w:r>
-      <w:r>
-        <w:t>Git allow</w:t>
+        <w:t xml:space="preserve"> Git allow</w:t>
       </w:r>
       <w:r>
         <w:t>s</w:t>
@@ -15709,10 +15706,7 @@
         <w:t xml:space="preserve"> multiple developers to work on the same project simultaneously</w:t>
       </w:r>
       <w:r>
-        <w:t>. Developers can work without having to be permanently connected to a central repository.</w:t>
-      </w:r>
-      <w:r>
-        <w:t xml:space="preserve"> An additional benefit is that even if one repository is lost, it can be cloned from another repository.</w:t>
+        <w:t>. Developers can work without having to be permanently connected to a central repository. An additional benefit is that even if one repository is lost, it can be cloned from another repository.</w:t>
       </w:r>
     </w:p>
     <w:p>
@@ -15737,7 +15731,7 @@
         <w:lastRenderedPageBreak/>
         <w:t>Modular Database Applications</w:t>
       </w:r>
-      <w:bookmarkEnd w:id="36"/>
+      <w:bookmarkEnd w:id="37"/>
       <w:bookmarkEnd w:id="69"/>
     </w:p>
     <w:p/>
@@ -15949,8 +15943,8 @@
         <w:pStyle w:val="Heading3"/>
       </w:pPr>
       <w:bookmarkStart w:id="73" w:name="_Normalizaton"/>
-      <w:bookmarkStart w:id="74" w:name="_Hlk111364307"/>
-      <w:bookmarkStart w:id="75" w:name="_Toc229766035"/>
+      <w:bookmarkStart w:id="74" w:name="_Toc229766035"/>
+      <w:bookmarkStart w:id="75" w:name="_Hlk111364307"/>
       <w:bookmarkEnd w:id="73"/>
       <w:r>
         <w:t>Normalizat</w:t>
@@ -15961,7 +15955,7 @@
       <w:r>
         <w:t>on</w:t>
       </w:r>
-      <w:bookmarkEnd w:id="75"/>
+      <w:bookmarkEnd w:id="74"/>
     </w:p>
     <w:p>
       <w:pPr>
@@ -23273,7 +23267,7 @@
     <w:p/>
     <w:p>
       <w:bookmarkStart w:id="78" w:name="_Toc110878101"/>
-      <w:bookmarkEnd w:id="74"/>
+      <w:bookmarkEnd w:id="75"/>
       <w:r>
         <w:rPr>
           <w:noProof/>
@@ -24670,7 +24664,7 @@
       <w:r>
         <w:t>Golden Rules</w:t>
       </w:r>
-      <w:bookmarkEnd w:id="37"/>
+      <w:bookmarkEnd w:id="38"/>
       <w:r>
         <w:t xml:space="preserve"> for Software Development</w:t>
       </w:r>
@@ -33886,6 +33880,7 @@
     <w:rsid w:val="000B375A"/>
     <w:rsid w:val="000B4C81"/>
     <w:rsid w:val="0010502F"/>
+    <w:rsid w:val="00163B0F"/>
     <w:rsid w:val="00193432"/>
     <w:rsid w:val="001C1D6B"/>
     <w:rsid w:val="001D0772"/>
@@ -33978,6 +33973,7 @@
     <w:rsid w:val="00D50709"/>
     <w:rsid w:val="00D615EE"/>
     <w:rsid w:val="00D74D47"/>
+    <w:rsid w:val="00D84EFF"/>
     <w:rsid w:val="00D857AF"/>
     <w:rsid w:val="00E039BD"/>
     <w:rsid w:val="00E34095"/>

</xml_diff>

<commit_message>
Read Me updated to remove APPSDEMO.zip as demo on GitHub
</commit_message>
<xml_diff>
--- a/documentation/Read Me.docx
+++ b/documentation/Read Me.docx
@@ -259,7 +259,7 @@
                     <w:docPart w:val="1044D2AAB96043E0A1F96645405FAD85"/>
                   </w:placeholder>
                   <w:dataBinding w:prefixMappings="xmlns:ns0='http://schemas.microsoft.com/office/2006/coverPageProps'" w:xpath="/ns0:CoverPageProperties[1]/ns0:PublishDate[1]" w:storeItemID="{55AF091B-3C7A-41E3-B477-F2FDAA23CFDA}"/>
-                  <w:date w:fullDate="2026-05-15T00:00:00Z">
+                  <w:date w:fullDate="2026-05-17T00:00:00Z">
                     <w:dateFormat w:val="M-d-yyyy"/>
                     <w:lid w:val="en-US"/>
                     <w:storeMappedDataAs w:val="dateTime"/>
@@ -282,7 +282,7 @@
                         <w:sz w:val="28"/>
                         <w:szCs w:val="28"/>
                       </w:rPr>
-                      <w:t>5-15-2026</w:t>
+                      <w:t>5-17-2026</w:t>
                     </w:r>
                   </w:p>
                 </w:sdtContent>
@@ -9684,33 +9684,19 @@
         <w:t xml:space="preserve">Download </w:t>
       </w:r>
       <w:r>
-        <w:t>the demo application from the GitHub repository or Bond &amp; Pollard Website.</w:t>
-      </w:r>
-    </w:p>
-    <w:p>
-      <w:pPr>
-        <w:rPr>
-          <w:rStyle w:val="Hyperlink"/>
-          <w:color w:val="auto"/>
-          <w:u w:val="none"/>
-        </w:rPr>
-      </w:pPr>
+        <w:t>the demo application from the GitHub repository</w:t>
+      </w:r>
+      <w:r>
+        <w:t>.</w:t>
+      </w:r>
+    </w:p>
+    <w:p>
       <w:hyperlink r:id="rId32" w:history="1">
         <w:r>
           <w:rPr>
             <w:rStyle w:val="Hyperlink"/>
           </w:rPr>
           <w:t>https://github.com/bondandpollard/oracle-appsdemo/archive/refs/heads/main.zip</w:t>
-        </w:r>
-      </w:hyperlink>
-    </w:p>
-    <w:p>
-      <w:hyperlink r:id="rId33" w:history="1">
-        <w:r>
-          <w:rPr>
-            <w:rStyle w:val="Hyperlink"/>
-          </w:rPr>
-          <w:t>http://www.bondpollard.co.uk/</w:t>
         </w:r>
       </w:hyperlink>
     </w:p>
@@ -9778,7 +9764,7 @@
                     <pic:cNvPicPr/>
                   </pic:nvPicPr>
                   <pic:blipFill>
-                    <a:blip r:embed="rId34"/>
+                    <a:blip r:embed="rId33"/>
                     <a:stretch>
                       <a:fillRect/>
                     </a:stretch>
@@ -9847,7 +9833,7 @@
                     <pic:cNvPicPr/>
                   </pic:nvPicPr>
                   <pic:blipFill>
-                    <a:blip r:embed="rId35"/>
+                    <a:blip r:embed="rId34"/>
                     <a:stretch>
                       <a:fillRect/>
                     </a:stretch>
@@ -9910,7 +9896,7 @@
                     <pic:cNvPicPr/>
                   </pic:nvPicPr>
                   <pic:blipFill>
-                    <a:blip r:embed="rId36"/>
+                    <a:blip r:embed="rId35"/>
                     <a:stretch>
                       <a:fillRect/>
                     </a:stretch>
@@ -9983,7 +9969,7 @@
                     <pic:cNvPicPr/>
                   </pic:nvPicPr>
                   <pic:blipFill>
-                    <a:blip r:embed="rId37"/>
+                    <a:blip r:embed="rId36"/>
                     <a:stretch>
                       <a:fillRect/>
                     </a:stretch>
@@ -10080,7 +10066,7 @@
                     <pic:cNvPicPr/>
                   </pic:nvPicPr>
                   <pic:blipFill>
-                    <a:blip r:embed="rId38"/>
+                    <a:blip r:embed="rId37"/>
                     <a:stretch>
                       <a:fillRect/>
                     </a:stretch>
@@ -10129,7 +10115,7 @@
                     <pic:cNvPicPr/>
                   </pic:nvPicPr>
                   <pic:blipFill>
-                    <a:blip r:embed="rId39"/>
+                    <a:blip r:embed="rId38"/>
                     <a:stretch>
                       <a:fillRect/>
                     </a:stretch>
@@ -10211,7 +10197,7 @@
                     <pic:cNvPicPr/>
                   </pic:nvPicPr>
                   <pic:blipFill>
-                    <a:blip r:embed="rId40"/>
+                    <a:blip r:embed="rId39"/>
                     <a:stretch>
                       <a:fillRect/>
                     </a:stretch>
@@ -10304,7 +10290,7 @@
                     <pic:cNvPicPr/>
                   </pic:nvPicPr>
                   <pic:blipFill>
-                    <a:blip r:embed="rId41"/>
+                    <a:blip r:embed="rId40"/>
                     <a:stretch>
                       <a:fillRect/>
                     </a:stretch>
@@ -10381,7 +10367,7 @@
                     <pic:cNvPicPr/>
                   </pic:nvPicPr>
                   <pic:blipFill>
-                    <a:blip r:embed="rId42"/>
+                    <a:blip r:embed="rId41"/>
                     <a:stretch>
                       <a:fillRect/>
                     </a:stretch>
@@ -10468,7 +10454,7 @@
                     <pic:cNvPicPr/>
                   </pic:nvPicPr>
                   <pic:blipFill>
-                    <a:blip r:embed="rId43"/>
+                    <a:blip r:embed="rId42"/>
                     <a:stretch>
                       <a:fillRect/>
                     </a:stretch>
@@ -10558,7 +10544,7 @@
                     <pic:cNvPicPr/>
                   </pic:nvPicPr>
                   <pic:blipFill>
-                    <a:blip r:embed="rId44"/>
+                    <a:blip r:embed="rId43"/>
                     <a:stretch>
                       <a:fillRect/>
                     </a:stretch>
@@ -10668,7 +10654,7 @@
                     <pic:cNvPicPr/>
                   </pic:nvPicPr>
                   <pic:blipFill>
-                    <a:blip r:embed="rId45"/>
+                    <a:blip r:embed="rId44"/>
                     <a:stretch>
                       <a:fillRect/>
                     </a:stretch>
@@ -10795,7 +10781,7 @@
                     <pic:cNvPicPr/>
                   </pic:nvPicPr>
                   <pic:blipFill>
-                    <a:blip r:embed="rId46"/>
+                    <a:blip r:embed="rId45"/>
                     <a:stretch>
                       <a:fillRect/>
                     </a:stretch>
@@ -10853,7 +10839,7 @@
                     <pic:cNvPicPr/>
                   </pic:nvPicPr>
                   <pic:blipFill>
-                    <a:blip r:embed="rId47"/>
+                    <a:blip r:embed="rId46"/>
                     <a:stretch>
                       <a:fillRect/>
                     </a:stretch>
@@ -11065,7 +11051,7 @@
                     <pic:cNvPicPr/>
                   </pic:nvPicPr>
                   <pic:blipFill>
-                    <a:blip r:embed="rId48"/>
+                    <a:blip r:embed="rId47"/>
                     <a:stretch>
                       <a:fillRect/>
                     </a:stretch>
@@ -11143,7 +11129,7 @@
                     <pic:cNvPicPr/>
                   </pic:nvPicPr>
                   <pic:blipFill>
-                    <a:blip r:embed="rId49"/>
+                    <a:blip r:embed="rId48"/>
                     <a:stretch>
                       <a:fillRect/>
                     </a:stretch>
@@ -11191,7 +11177,7 @@
                     <pic:cNvPicPr/>
                   </pic:nvPicPr>
                   <pic:blipFill>
-                    <a:blip r:embed="rId50"/>
+                    <a:blip r:embed="rId49"/>
                     <a:stretch>
                       <a:fillRect/>
                     </a:stretch>
@@ -11250,7 +11236,7 @@
                     <pic:cNvPicPr/>
                   </pic:nvPicPr>
                   <pic:blipFill>
-                    <a:blip r:embed="rId51"/>
+                    <a:blip r:embed="rId50"/>
                     <a:stretch>
                       <a:fillRect/>
                     </a:stretch>
@@ -11330,7 +11316,7 @@
                     <pic:cNvPicPr/>
                   </pic:nvPicPr>
                   <pic:blipFill>
-                    <a:blip r:embed="rId52"/>
+                    <a:blip r:embed="rId51"/>
                     <a:stretch>
                       <a:fillRect/>
                     </a:stretch>
@@ -11752,7 +11738,7 @@
                     <pic:cNvPicPr/>
                   </pic:nvPicPr>
                   <pic:blipFill>
-                    <a:blip r:embed="rId52"/>
+                    <a:blip r:embed="rId51"/>
                     <a:stretch>
                       <a:fillRect/>
                     </a:stretch>
@@ -11803,7 +11789,7 @@
                     <pic:cNvPicPr/>
                   </pic:nvPicPr>
                   <pic:blipFill>
-                    <a:blip r:embed="rId53"/>
+                    <a:blip r:embed="rId52"/>
                     <a:stretch>
                       <a:fillRect/>
                     </a:stretch>
@@ -12015,7 +12001,7 @@
                     <pic:cNvPicPr/>
                   </pic:nvPicPr>
                   <pic:blipFill>
-                    <a:blip r:embed="rId54"/>
+                    <a:blip r:embed="rId53"/>
                     <a:stretch>
                       <a:fillRect/>
                     </a:stretch>
@@ -12145,7 +12131,7 @@
                     <pic:cNvPicPr/>
                   </pic:nvPicPr>
                   <pic:blipFill>
-                    <a:blip r:embed="rId55"/>
+                    <a:blip r:embed="rId54"/>
                     <a:stretch>
                       <a:fillRect/>
                     </a:stretch>
@@ -12360,7 +12346,7 @@
                     <pic:cNvPicPr/>
                   </pic:nvPicPr>
                   <pic:blipFill>
-                    <a:blip r:embed="rId56"/>
+                    <a:blip r:embed="rId55"/>
                     <a:stretch>
                       <a:fillRect/>
                     </a:stretch>
@@ -12461,7 +12447,7 @@
                     <pic:cNvPicPr/>
                   </pic:nvPicPr>
                   <pic:blipFill>
-                    <a:blip r:embed="rId57"/>
+                    <a:blip r:embed="rId56"/>
                     <a:stretch>
                       <a:fillRect/>
                     </a:stretch>
@@ -12524,7 +12510,7 @@
                     <pic:cNvPicPr/>
                   </pic:nvPicPr>
                   <pic:blipFill>
-                    <a:blip r:embed="rId58"/>
+                    <a:blip r:embed="rId57"/>
                     <a:stretch>
                       <a:fillRect/>
                     </a:stretch>
@@ -12574,7 +12560,7 @@
                     <pic:cNvPicPr/>
                   </pic:nvPicPr>
                   <pic:blipFill>
-                    <a:blip r:embed="rId59"/>
+                    <a:blip r:embed="rId58"/>
                     <a:stretch>
                       <a:fillRect/>
                     </a:stretch>
@@ -12629,7 +12615,7 @@
                     <pic:cNvPicPr/>
                   </pic:nvPicPr>
                   <pic:blipFill>
-                    <a:blip r:embed="rId60"/>
+                    <a:blip r:embed="rId59"/>
                     <a:stretch>
                       <a:fillRect/>
                     </a:stretch>
@@ -12677,7 +12663,7 @@
                     <pic:cNvPicPr/>
                   </pic:nvPicPr>
                   <pic:blipFill>
-                    <a:blip r:embed="rId61"/>
+                    <a:blip r:embed="rId60"/>
                     <a:stretch>
                       <a:fillRect/>
                     </a:stretch>
@@ -12720,7 +12706,7 @@
                     <pic:cNvPicPr/>
                   </pic:nvPicPr>
                   <pic:blipFill>
-                    <a:blip r:embed="rId62"/>
+                    <a:blip r:embed="rId61"/>
                     <a:stretch>
                       <a:fillRect/>
                     </a:stretch>
@@ -12772,7 +12758,7 @@
                     <pic:cNvPicPr/>
                   </pic:nvPicPr>
                   <pic:blipFill>
-                    <a:blip r:embed="rId63"/>
+                    <a:blip r:embed="rId62"/>
                     <a:stretch>
                       <a:fillRect/>
                     </a:stretch>
@@ -12832,7 +12818,7 @@
                     <pic:cNvPicPr/>
                   </pic:nvPicPr>
                   <pic:blipFill>
-                    <a:blip r:embed="rId64"/>
+                    <a:blip r:embed="rId63"/>
                     <a:stretch>
                       <a:fillRect/>
                     </a:stretch>
@@ -13032,7 +13018,7 @@
                     <pic:cNvPicPr/>
                   </pic:nvPicPr>
                   <pic:blipFill>
-                    <a:blip r:embed="rId65"/>
+                    <a:blip r:embed="rId64"/>
                     <a:stretch>
                       <a:fillRect/>
                     </a:stretch>
@@ -13102,7 +13088,7 @@
                     <pic:cNvPicPr/>
                   </pic:nvPicPr>
                   <pic:blipFill>
-                    <a:blip r:embed="rId66"/>
+                    <a:blip r:embed="rId65"/>
                     <a:stretch>
                       <a:fillRect/>
                     </a:stretch>
@@ -13170,7 +13156,7 @@
                     <pic:cNvPicPr/>
                   </pic:nvPicPr>
                   <pic:blipFill>
-                    <a:blip r:embed="rId67"/>
+                    <a:blip r:embed="rId66"/>
                     <a:stretch>
                       <a:fillRect/>
                     </a:stretch>
@@ -13247,7 +13233,7 @@
                     <pic:cNvPicPr/>
                   </pic:nvPicPr>
                   <pic:blipFill>
-                    <a:blip r:embed="rId68"/>
+                    <a:blip r:embed="rId67"/>
                     <a:stretch>
                       <a:fillRect/>
                     </a:stretch>
@@ -13322,7 +13308,7 @@
                     <pic:cNvPicPr/>
                   </pic:nvPicPr>
                   <pic:blipFill>
-                    <a:blip r:embed="rId69"/>
+                    <a:blip r:embed="rId68"/>
                     <a:stretch>
                       <a:fillRect/>
                     </a:stretch>
@@ -13492,7 +13478,7 @@
                     <pic:cNvPicPr/>
                   </pic:nvPicPr>
                   <pic:blipFill>
-                    <a:blip r:embed="rId70"/>
+                    <a:blip r:embed="rId69"/>
                     <a:stretch>
                       <a:fillRect/>
                     </a:stretch>
@@ -13604,7 +13590,7 @@
                     <pic:cNvPicPr/>
                   </pic:nvPicPr>
                   <pic:blipFill>
-                    <a:blip r:embed="rId71"/>
+                    <a:blip r:embed="rId70"/>
                     <a:stretch>
                       <a:fillRect/>
                     </a:stretch>
@@ -13648,7 +13634,7 @@
                     <pic:cNvPicPr/>
                   </pic:nvPicPr>
                   <pic:blipFill>
-                    <a:blip r:embed="rId72"/>
+                    <a:blip r:embed="rId71"/>
                     <a:stretch>
                       <a:fillRect/>
                     </a:stretch>
@@ -13924,7 +13910,7 @@
                     <pic:cNvPicPr/>
                   </pic:nvPicPr>
                   <pic:blipFill>
-                    <a:blip r:embed="rId73"/>
+                    <a:blip r:embed="rId72"/>
                     <a:stretch>
                       <a:fillRect/>
                     </a:stretch>
@@ -14038,7 +14024,7 @@
                     <pic:cNvPicPr/>
                   </pic:nvPicPr>
                   <pic:blipFill>
-                    <a:blip r:embed="rId74"/>
+                    <a:blip r:embed="rId73"/>
                     <a:stretch>
                       <a:fillRect/>
                     </a:stretch>
@@ -14114,7 +14100,7 @@
                     <pic:cNvPicPr/>
                   </pic:nvPicPr>
                   <pic:blipFill>
-                    <a:blip r:embed="rId75"/>
+                    <a:blip r:embed="rId74"/>
                     <a:stretch>
                       <a:fillRect/>
                     </a:stretch>
@@ -14194,7 +14180,7 @@
                     <pic:cNvPicPr/>
                   </pic:nvPicPr>
                   <pic:blipFill>
-                    <a:blip r:embed="rId76"/>
+                    <a:blip r:embed="rId75"/>
                     <a:stretch>
                       <a:fillRect/>
                     </a:stretch>
@@ -14527,7 +14513,7 @@
       <w:r>
         <w:t xml:space="preserve">At the very least you should document all of your </w:t>
       </w:r>
-      <w:hyperlink r:id="rId77" w:history="1">
+      <w:hyperlink r:id="rId76" w:history="1">
         <w:r>
           <w:rPr>
             <w:rStyle w:val="Hyperlink"/>
@@ -15415,7 +15401,7 @@
           <w:numId w:val="34"/>
         </w:numPr>
       </w:pPr>
-      <w:hyperlink r:id="rId78" w:history="1">
+      <w:hyperlink r:id="rId77" w:history="1">
         <w:r>
           <w:rPr>
             <w:rStyle w:val="Hyperlink"/>
@@ -15432,7 +15418,7 @@
           <w:numId w:val="34"/>
         </w:numPr>
       </w:pPr>
-      <w:hyperlink r:id="rId79" w:history="1">
+      <w:hyperlink r:id="rId78" w:history="1">
         <w:r>
           <w:rPr>
             <w:rStyle w:val="Hyperlink"/>
@@ -23288,7 +23274,7 @@
                     <pic:cNvPicPr/>
                   </pic:nvPicPr>
                   <pic:blipFill>
-                    <a:blip r:embed="rId80">
+                    <a:blip r:embed="rId79">
                       <a:extLst>
                         <a:ext uri="{28A0092B-C50C-407E-A947-70E740481C1C}">
                           <a14:useLocalDpi xmlns:a14="http://schemas.microsoft.com/office/drawing/2010/main" val="0"/>
@@ -27744,7 +27730,7 @@
     <w:p/>
     <w:p/>
     <w:sectPr>
-      <w:footerReference w:type="default" r:id="rId81"/>
+      <w:footerReference w:type="default" r:id="rId80"/>
       <w:pgSz w:w="11906" w:h="16838"/>
       <w:pgMar w:top="1440" w:right="1440" w:bottom="1440" w:left="1440" w:header="708" w:footer="708" w:gutter="0"/>
       <w:pgNumType w:start="0"/>
@@ -33915,6 +33901,7 @@
     <w:rsid w:val="0060745A"/>
     <w:rsid w:val="00652C2E"/>
     <w:rsid w:val="00654710"/>
+    <w:rsid w:val="00677EB7"/>
     <w:rsid w:val="00680A18"/>
     <w:rsid w:val="006858A1"/>
     <w:rsid w:val="006C699C"/>
@@ -33927,6 +33914,7 @@
     <w:rsid w:val="007A0DDB"/>
     <w:rsid w:val="007D6CF7"/>
     <w:rsid w:val="007E3B19"/>
+    <w:rsid w:val="007E77C9"/>
     <w:rsid w:val="007F4869"/>
     <w:rsid w:val="0082232D"/>
     <w:rsid w:val="00824F03"/>
@@ -34729,7 +34717,7 @@
 
 <file path=customXml/item1.xml><?xml version="1.0" encoding="utf-8"?>
 <CoverPageProperties xmlns="http://schemas.microsoft.com/office/2006/coverPageProps">
-  <PublishDate>2026-05-15T00:00:00</PublishDate>
+  <PublishDate>2026-05-17T00:00:00</PublishDate>
   <Abstract/>
   <CompanyAddress/>
   <CompanyPhone/>

</xml_diff>